<commit_message>
ADDING TODAY'S WORK - 24.08.2026
</commit_message>
<xml_diff>
--- a/viva/viva_questions_plan.docx
+++ b/viva/viva_questions_plan.docx
@@ -51,7 +51,15 @@
         </w:numPr>
       </w:pPr>
       <w:r>
-        <w:t>One common last question is ‘if you have more money and time what would you do next?’ and ‘is your research useful to someone else?’</w:t>
+        <w:t xml:space="preserve">One common last question is ‘if you have more money and time what </w:t>
+      </w:r>
+      <w:proofErr w:type="gramStart"/>
+      <w:r>
+        <w:t>would you</w:t>
+      </w:r>
+      <w:proofErr w:type="gramEnd"/>
+      <w:r>
+        <w:t xml:space="preserve"> do next?’ and ‘is your research useful to someone else?’</w:t>
       </w:r>
     </w:p>
     <w:p>
@@ -485,7 +493,15 @@
         </w:numPr>
       </w:pPr>
       <w:r>
-        <w:t xml:space="preserve">Supplementary table 2 listing all the DE miRNAs is wrong for all the protease samples – it just shows the der p 1 inactive results for each of the protease conditions. </w:t>
+        <w:t xml:space="preserve">Supplementary table 2 listing all the DE miRNAs </w:t>
+      </w:r>
+      <w:proofErr w:type="gramStart"/>
+      <w:r>
+        <w:t>is</w:t>
+      </w:r>
+      <w:proofErr w:type="gramEnd"/>
+      <w:r>
+        <w:t xml:space="preserve"> wrong for all the protease samples – it just shows the der p 1 inactive results for each of the protease conditions. </w:t>
       </w:r>
       <w:r>
         <w:rPr>
@@ -499,7 +515,23 @@
           <w:b/>
           <w:bCs/>
         </w:rPr>
-        <w:t>in the local github folder but not pushed it</w:t>
+        <w:t xml:space="preserve">in the local </w:t>
+      </w:r>
+      <w:proofErr w:type="spellStart"/>
+      <w:r>
+        <w:rPr>
+          <w:b/>
+          <w:bCs/>
+        </w:rPr>
+        <w:t>github</w:t>
+      </w:r>
+      <w:proofErr w:type="spellEnd"/>
+      <w:r>
+        <w:rPr>
+          <w:b/>
+          <w:bCs/>
+        </w:rPr>
+        <w:t xml:space="preserve"> folder but not pushed it</w:t>
       </w:r>
     </w:p>
     <w:p/>
@@ -521,7 +553,15 @@
         </w:numPr>
       </w:pPr>
       <w:r>
-        <w:t xml:space="preserve">Why did you only perform ORA during target-gene enrichment but you performed ORA and miRNA-SEA at miRNA-level? </w:t>
+        <w:t xml:space="preserve">Why did you only perform ORA during target-gene </w:t>
+      </w:r>
+      <w:proofErr w:type="gramStart"/>
+      <w:r>
+        <w:t>enrichment</w:t>
+      </w:r>
+      <w:proofErr w:type="gramEnd"/>
+      <w:r>
+        <w:t xml:space="preserve"> but you performed ORA and miRNA-SEA at miRNA-level? </w:t>
       </w:r>
     </w:p>
     <w:p>
@@ -537,7 +577,32 @@
           <w:b/>
           <w:bCs/>
         </w:rPr>
-        <w:t>Could have used gsePathway()…</w:t>
+        <w:t xml:space="preserve">Could have used </w:t>
+      </w:r>
+      <w:proofErr w:type="spellStart"/>
+      <w:proofErr w:type="gramStart"/>
+      <w:r>
+        <w:rPr>
+          <w:b/>
+          <w:bCs/>
+        </w:rPr>
+        <w:t>gsePathway</w:t>
+      </w:r>
+      <w:proofErr w:type="spellEnd"/>
+      <w:r>
+        <w:rPr>
+          <w:b/>
+          <w:bCs/>
+        </w:rPr>
+        <w:t>(</w:t>
+      </w:r>
+      <w:proofErr w:type="gramEnd"/>
+      <w:r>
+        <w:rPr>
+          <w:b/>
+          <w:bCs/>
+        </w:rPr>
+        <w:t>)…</w:t>
       </w:r>
     </w:p>
     <w:p>
@@ -561,7 +626,23 @@
         </w:numPr>
       </w:pPr>
       <w:r>
-        <w:t xml:space="preserve">Why did you use a higher significance threshold for miRNA-level enrichment (Padj &lt; 0.05) over target gene (Padj &lt; 0.02)? </w:t>
+        <w:t>Why did you use a higher significance threshold for miRNA-level enrichment (</w:t>
+      </w:r>
+      <w:proofErr w:type="spellStart"/>
+      <w:r>
+        <w:t>Padj</w:t>
+      </w:r>
+      <w:proofErr w:type="spellEnd"/>
+      <w:r>
+        <w:t xml:space="preserve"> &lt; 0.05) over target gene (</w:t>
+      </w:r>
+      <w:proofErr w:type="spellStart"/>
+      <w:r>
+        <w:t>Padj</w:t>
+      </w:r>
+      <w:proofErr w:type="spellEnd"/>
+      <w:r>
+        <w:t xml:space="preserve"> &lt; 0.02)? </w:t>
       </w:r>
       <w:r>
         <w:rPr>
@@ -570,6 +651,7 @@
         </w:rPr>
         <w:t xml:space="preserve">Because there are fewer miRNA-pathway relationships and therefore there are likely to be fewer very significant pathways, so I didn’t want to miss anything by using a stricter threshold. Whereas, for target gene enrichment, the higher significance caused almost half of all </w:t>
       </w:r>
+      <w:proofErr w:type="spellStart"/>
       <w:r>
         <w:rPr>
           <w:b/>
@@ -577,6 +659,7 @@
         </w:rPr>
         <w:t>Reactome</w:t>
       </w:r>
+      <w:proofErr w:type="spellEnd"/>
       <w:r>
         <w:rPr>
           <w:b/>
@@ -627,7 +710,55 @@
           <w:bCs/>
         </w:rPr>
         <w:lastRenderedPageBreak/>
-        <w:t>Could look at detecting different types of small rna species e.g., what tamirna does in their reads classification table</w:t>
+        <w:t xml:space="preserve">Could look at detecting different types of small </w:t>
+      </w:r>
+      <w:proofErr w:type="spellStart"/>
+      <w:r>
+        <w:rPr>
+          <w:b/>
+          <w:bCs/>
+        </w:rPr>
+        <w:t>rna</w:t>
+      </w:r>
+      <w:proofErr w:type="spellEnd"/>
+      <w:r>
+        <w:rPr>
+          <w:b/>
+          <w:bCs/>
+        </w:rPr>
+        <w:t xml:space="preserve"> species e.g., what </w:t>
+      </w:r>
+      <w:proofErr w:type="spellStart"/>
+      <w:r>
+        <w:rPr>
+          <w:b/>
+          <w:bCs/>
+        </w:rPr>
+        <w:t>tamirna</w:t>
+      </w:r>
+      <w:proofErr w:type="spellEnd"/>
+      <w:r>
+        <w:rPr>
+          <w:b/>
+          <w:bCs/>
+        </w:rPr>
+        <w:t xml:space="preserve"> does in their </w:t>
+      </w:r>
+      <w:proofErr w:type="gramStart"/>
+      <w:r>
+        <w:rPr>
+          <w:b/>
+          <w:bCs/>
+        </w:rPr>
+        <w:t>reads</w:t>
+      </w:r>
+      <w:proofErr w:type="gramEnd"/>
+      <w:r>
+        <w:rPr>
+          <w:b/>
+          <w:bCs/>
+        </w:rPr>
+        <w:t xml:space="preserve"> classification table</w:t>
       </w:r>
     </w:p>
     <w:p>
@@ -706,7 +837,23 @@
           <w:b/>
           <w:bCs/>
         </w:rPr>
-        <w:t>It is also possible that they are working agonistically because the target genes being targeted by upregulated are stimulatory and the downregulated ones are inhibitory therefore they are working in the same direction</w:t>
+        <w:t xml:space="preserve">It is also possible that they are working agonistically because the target genes being targeted by upregulated are stimulatory and the downregulated ones are inhibitory </w:t>
+      </w:r>
+      <w:proofErr w:type="gramStart"/>
+      <w:r>
+        <w:rPr>
+          <w:b/>
+          <w:bCs/>
+        </w:rPr>
+        <w:t>therefore</w:t>
+      </w:r>
+      <w:proofErr w:type="gramEnd"/>
+      <w:r>
+        <w:rPr>
+          <w:b/>
+          <w:bCs/>
+        </w:rPr>
+        <w:t xml:space="preserve"> they are working in the same direction</w:t>
       </w:r>
     </w:p>
     <w:p>
@@ -730,14 +877,38 @@
         </w:numPr>
       </w:pPr>
       <w:r>
-        <w:t xml:space="preserve">Why is RT-qPCR necessary if you already have small RNA-seq data? </w:t>
-      </w:r>
-      <w:r>
-        <w:rPr>
-          <w:b/>
-          <w:bCs/>
-        </w:rPr>
-        <w:t>Small RNA-seq is genome-wide whereas PCR is very specific. Using both methods reduces the risk that results were found due to technical artefacts.</w:t>
+        <w:t>Why is RT-qPCR necessary if you already have small RNA-</w:t>
+      </w:r>
+      <w:proofErr w:type="spellStart"/>
+      <w:r>
+        <w:t>seq</w:t>
+      </w:r>
+      <w:proofErr w:type="spellEnd"/>
+      <w:r>
+        <w:t xml:space="preserve"> data? </w:t>
+      </w:r>
+      <w:r>
+        <w:rPr>
+          <w:b/>
+          <w:bCs/>
+        </w:rPr>
+        <w:t>Small RNA-</w:t>
+      </w:r>
+      <w:proofErr w:type="spellStart"/>
+      <w:r>
+        <w:rPr>
+          <w:b/>
+          <w:bCs/>
+        </w:rPr>
+        <w:t>seq</w:t>
+      </w:r>
+      <w:proofErr w:type="spellEnd"/>
+      <w:r>
+        <w:rPr>
+          <w:b/>
+          <w:bCs/>
+        </w:rPr>
+        <w:t xml:space="preserve"> is genome-wide whereas PCR is very specific. Using both methods reduces the risk that results were found due to technical artefacts.</w:t>
       </w:r>
     </w:p>
     <w:p>
@@ -800,15 +971,40 @@
           <w:b/>
           <w:bCs/>
         </w:rPr>
-        <w:t xml:space="preserve">The greatest overall challenge was deciding what the project was actually about. Because I received the data in a staggered way, the aim of the project kept changing based on the results of the data as I could no longer do what I set out to do. This is a good example of how projects can change over time and when you are doing stuff in a short </w:t>
-      </w:r>
+        <w:t xml:space="preserve">The greatest overall challenge was deciding what the project was </w:t>
+      </w:r>
+      <w:proofErr w:type="gramStart"/>
+      <w:r>
+        <w:rPr>
+          <w:b/>
+          <w:bCs/>
+        </w:rPr>
+        <w:t>actually about</w:t>
+      </w:r>
+      <w:proofErr w:type="gramEnd"/>
+      <w:r>
+        <w:rPr>
+          <w:b/>
+          <w:bCs/>
+        </w:rPr>
+        <w:t xml:space="preserve">. Because I received the data in a staggered way, the aim of the project kept changing based on the results of the data as I could no longer do what I set out to do. This is a good example of how projects can change over time and when you are doing stuff in a short </w:t>
+      </w:r>
+      <w:proofErr w:type="gramStart"/>
       <w:r>
         <w:rPr>
           <w:b/>
           <w:bCs/>
         </w:rPr>
         <w:lastRenderedPageBreak/>
-        <w:t>time period, you may not be able to reach the depth of analysis you might like to.</w:t>
+        <w:t>time period</w:t>
+      </w:r>
+      <w:proofErr w:type="gramEnd"/>
+      <w:r>
+        <w:rPr>
+          <w:b/>
+          <w:bCs/>
+        </w:rPr>
+        <w:t>, you may not be able to reach the depth of analysis you might like to.</w:t>
       </w:r>
     </w:p>
     <w:p>
@@ -884,6 +1080,161 @@
       </w:pPr>
       <w:r>
         <w:t xml:space="preserve">You say more research is required to validate the finding that miR-125b-5p may be a common allergen response miRNA – what would that extra research be? </w:t>
+      </w:r>
+    </w:p>
+    <w:p>
+      <w:pPr>
+        <w:pStyle w:val="ListParagraph"/>
+        <w:numPr>
+          <w:ilvl w:val="0"/>
+          <w:numId w:val="5"/>
+        </w:numPr>
+      </w:pPr>
+      <w:r>
+        <w:t>How do you know WNT/NOTCH/</w:t>
+      </w:r>
+      <w:proofErr w:type="spellStart"/>
+      <w:r>
+        <w:t>RHOGTPase</w:t>
+      </w:r>
+      <w:proofErr w:type="spellEnd"/>
+      <w:r>
+        <w:t xml:space="preserve"> pathways are involved in epithelial barrier homeostasis? </w:t>
+      </w:r>
+      <w:r>
+        <w:rPr>
+          <w:b/>
+          <w:bCs/>
+        </w:rPr>
+        <w:t>WNT and NOTCH I’ve seen in papers [think this is in Browne’s 2025 review</w:t>
+      </w:r>
+      <w:r>
+        <w:rPr>
+          <w:b/>
+          <w:bCs/>
+        </w:rPr>
+        <w:t xml:space="preserve"> – WNT implicated in tight junction maintenance</w:t>
+      </w:r>
+      <w:r>
+        <w:rPr>
+          <w:b/>
+          <w:bCs/>
+        </w:rPr>
+        <w:t xml:space="preserve">], RHO </w:t>
+      </w:r>
+      <w:r>
+        <w:rPr>
+          <w:b/>
+          <w:bCs/>
+        </w:rPr>
+        <w:t>GTPase was a google.</w:t>
+      </w:r>
+      <w:r>
+        <w:rPr>
+          <w:b/>
+          <w:bCs/>
+        </w:rPr>
+        <w:t xml:space="preserve"> But because these are massive pathways that regulate so many different things, it is speculative to say that they are targeted in this </w:t>
+      </w:r>
+      <w:r>
+        <w:rPr>
+          <w:b/>
+          <w:bCs/>
+        </w:rPr>
+        <w:t xml:space="preserve">biological </w:t>
+      </w:r>
+      <w:r>
+        <w:rPr>
+          <w:b/>
+          <w:bCs/>
+        </w:rPr>
+        <w:t>model and affect barrier integrity – more research needed.</w:t>
+      </w:r>
+    </w:p>
+    <w:p>
+      <w:pPr>
+        <w:pStyle w:val="ListParagraph"/>
+        <w:numPr>
+          <w:ilvl w:val="0"/>
+          <w:numId w:val="5"/>
+        </w:numPr>
+      </w:pPr>
+      <w:r>
+        <w:t xml:space="preserve">What normalisation method did you use for differential expression analysis? </w:t>
+      </w:r>
+      <w:r>
+        <w:rPr>
+          <w:b/>
+          <w:bCs/>
+        </w:rPr>
+        <w:t>I used TMM normalisation which is the Trimmed Mean of M-values</w:t>
+      </w:r>
+      <w:r>
+        <w:t>. It uses the empirical Bayesian approach to basically normalise for sequencing depth.</w:t>
+      </w:r>
+      <w:r>
+        <w:t xml:space="preserve"> It is the default edgeR normalisation method.</w:t>
+      </w:r>
+    </w:p>
+    <w:p>
+      <w:pPr>
+        <w:pStyle w:val="ListParagraph"/>
+        <w:numPr>
+          <w:ilvl w:val="0"/>
+          <w:numId w:val="5"/>
+        </w:numPr>
+      </w:pPr>
+      <w:r>
+        <w:t xml:space="preserve">Why was miR-125b classed as a potential candidate for further research? </w:t>
+      </w:r>
+      <w:r>
+        <w:rPr>
+          <w:b/>
+          <w:bCs/>
+        </w:rPr>
+        <w:t>More publications so it may play a greater role. Also, it was detected in the protease</w:t>
+      </w:r>
+      <w:r>
+        <w:rPr>
+          <w:b/>
+          <w:bCs/>
+        </w:rPr>
+        <w:t xml:space="preserve"> dose 24 dataset so may be a common allergen response miRNA. The workflow needs to be repeated on robust data to confirm its differential expression.</w:t>
+      </w:r>
+    </w:p>
+    <w:p>
+      <w:pPr>
+        <w:pStyle w:val="ListParagraph"/>
+        <w:numPr>
+          <w:ilvl w:val="0"/>
+          <w:numId w:val="5"/>
+        </w:numPr>
+      </w:pPr>
+      <w:r>
+        <w:t xml:space="preserve">What is the significance of being able to handle spike in controls? </w:t>
+      </w:r>
+      <w:r>
+        <w:rPr>
+          <w:b/>
+          <w:bCs/>
+        </w:rPr>
+        <w:t xml:space="preserve">Spike in controls were present in the sequencing data made available for me, but I </w:t>
+      </w:r>
+      <w:proofErr w:type="gramStart"/>
+      <w:r>
+        <w:rPr>
+          <w:b/>
+          <w:bCs/>
+        </w:rPr>
+        <w:t>was not able to</w:t>
+      </w:r>
+      <w:proofErr w:type="gramEnd"/>
+      <w:r>
+        <w:rPr>
+          <w:b/>
+          <w:bCs/>
+        </w:rPr>
+        <w:t xml:space="preserve"> use it due to the complexity of handling it. Because miRNA is a minor constituent of the sequencing library, there are likely going to be lots of lowly expressed miRNAs and therefore it is really important to improve the analysis of them</w:t>
       </w:r>
     </w:p>
     <w:p/>

</xml_diff>

<commit_message>
ADDING TODAY'S WORK - 25.08.2026
</commit_message>
<xml_diff>
--- a/viva/viva_questions_plan.docx
+++ b/viva/viva_questions_plan.docx
@@ -51,15 +51,7 @@
         </w:numPr>
       </w:pPr>
       <w:r>
-        <w:t xml:space="preserve">One common last question is ‘if you have more money and time what </w:t>
-      </w:r>
-      <w:proofErr w:type="gramStart"/>
-      <w:r>
-        <w:t>would you</w:t>
-      </w:r>
-      <w:proofErr w:type="gramEnd"/>
-      <w:r>
-        <w:t xml:space="preserve"> do next?’ and ‘is your research useful to someone else?’</w:t>
+        <w:t>One common last question is ‘if you have more money and time what would you do next?’ and ‘is your research useful to someone else?’</w:t>
       </w:r>
     </w:p>
     <w:p>
@@ -493,15 +485,7 @@
         </w:numPr>
       </w:pPr>
       <w:r>
-        <w:t xml:space="preserve">Supplementary table 2 listing all the DE miRNAs </w:t>
-      </w:r>
-      <w:proofErr w:type="gramStart"/>
-      <w:r>
-        <w:t>is</w:t>
-      </w:r>
-      <w:proofErr w:type="gramEnd"/>
-      <w:r>
-        <w:t xml:space="preserve"> wrong for all the protease samples – it just shows the der p 1 inactive results for each of the protease conditions. </w:t>
+        <w:t xml:space="preserve">Supplementary table 2 listing all the DE miRNAs is wrong for all the protease samples – it just shows the der p 1 inactive results for each of the protease conditions. </w:t>
       </w:r>
       <w:r>
         <w:rPr>
@@ -515,23 +499,7 @@
           <w:b/>
           <w:bCs/>
         </w:rPr>
-        <w:t xml:space="preserve">in the local </w:t>
-      </w:r>
-      <w:proofErr w:type="spellStart"/>
-      <w:r>
-        <w:rPr>
-          <w:b/>
-          <w:bCs/>
-        </w:rPr>
-        <w:t>github</w:t>
-      </w:r>
-      <w:proofErr w:type="spellEnd"/>
-      <w:r>
-        <w:rPr>
-          <w:b/>
-          <w:bCs/>
-        </w:rPr>
-        <w:t xml:space="preserve"> folder but not pushed it</w:t>
+        <w:t>in the local github folder but not pushed it</w:t>
       </w:r>
     </w:p>
     <w:p/>
@@ -553,15 +521,7 @@
         </w:numPr>
       </w:pPr>
       <w:r>
-        <w:t xml:space="preserve">Why did you only perform ORA during target-gene </w:t>
-      </w:r>
-      <w:proofErr w:type="gramStart"/>
-      <w:r>
-        <w:t>enrichment</w:t>
-      </w:r>
-      <w:proofErr w:type="gramEnd"/>
-      <w:r>
-        <w:t xml:space="preserve"> but you performed ORA and miRNA-SEA at miRNA-level? </w:t>
+        <w:t xml:space="preserve">Why did you only perform ORA during target-gene enrichment but you performed ORA and miRNA-SEA at miRNA-level? </w:t>
       </w:r>
     </w:p>
     <w:p>
@@ -577,32 +537,7 @@
           <w:b/>
           <w:bCs/>
         </w:rPr>
-        <w:t xml:space="preserve">Could have used </w:t>
-      </w:r>
-      <w:proofErr w:type="spellStart"/>
-      <w:proofErr w:type="gramStart"/>
-      <w:r>
-        <w:rPr>
-          <w:b/>
-          <w:bCs/>
-        </w:rPr>
-        <w:t>gsePathway</w:t>
-      </w:r>
-      <w:proofErr w:type="spellEnd"/>
-      <w:r>
-        <w:rPr>
-          <w:b/>
-          <w:bCs/>
-        </w:rPr>
-        <w:t>(</w:t>
-      </w:r>
-      <w:proofErr w:type="gramEnd"/>
-      <w:r>
-        <w:rPr>
-          <w:b/>
-          <w:bCs/>
-        </w:rPr>
-        <w:t>)…</w:t>
+        <w:t>Could have used gsePathway()…</w:t>
       </w:r>
     </w:p>
     <w:p>
@@ -626,23 +561,7 @@
         </w:numPr>
       </w:pPr>
       <w:r>
-        <w:t>Why did you use a higher significance threshold for miRNA-level enrichment (</w:t>
-      </w:r>
-      <w:proofErr w:type="spellStart"/>
-      <w:r>
-        <w:t>Padj</w:t>
-      </w:r>
-      <w:proofErr w:type="spellEnd"/>
-      <w:r>
-        <w:t xml:space="preserve"> &lt; 0.05) over target gene (</w:t>
-      </w:r>
-      <w:proofErr w:type="spellStart"/>
-      <w:r>
-        <w:t>Padj</w:t>
-      </w:r>
-      <w:proofErr w:type="spellEnd"/>
-      <w:r>
-        <w:t xml:space="preserve"> &lt; 0.02)? </w:t>
+        <w:t xml:space="preserve">Why did you use a higher significance threshold for miRNA-level enrichment (Padj &lt; 0.05) over target gene (Padj &lt; 0.02)? </w:t>
       </w:r>
       <w:r>
         <w:rPr>
@@ -651,7 +570,6 @@
         </w:rPr>
         <w:t xml:space="preserve">Because there are fewer miRNA-pathway relationships and therefore there are likely to be fewer very significant pathways, so I didn’t want to miss anything by using a stricter threshold. Whereas, for target gene enrichment, the higher significance caused almost half of all </w:t>
       </w:r>
-      <w:proofErr w:type="spellStart"/>
       <w:r>
         <w:rPr>
           <w:b/>
@@ -659,7 +577,6 @@
         </w:rPr>
         <w:t>Reactome</w:t>
       </w:r>
-      <w:proofErr w:type="spellEnd"/>
       <w:r>
         <w:rPr>
           <w:b/>
@@ -710,55 +627,7 @@
           <w:bCs/>
         </w:rPr>
         <w:lastRenderedPageBreak/>
-        <w:t xml:space="preserve">Could look at detecting different types of small </w:t>
-      </w:r>
-      <w:proofErr w:type="spellStart"/>
-      <w:r>
-        <w:rPr>
-          <w:b/>
-          <w:bCs/>
-        </w:rPr>
-        <w:t>rna</w:t>
-      </w:r>
-      <w:proofErr w:type="spellEnd"/>
-      <w:r>
-        <w:rPr>
-          <w:b/>
-          <w:bCs/>
-        </w:rPr>
-        <w:t xml:space="preserve"> species e.g., what </w:t>
-      </w:r>
-      <w:proofErr w:type="spellStart"/>
-      <w:r>
-        <w:rPr>
-          <w:b/>
-          <w:bCs/>
-        </w:rPr>
-        <w:t>tamirna</w:t>
-      </w:r>
-      <w:proofErr w:type="spellEnd"/>
-      <w:r>
-        <w:rPr>
-          <w:b/>
-          <w:bCs/>
-        </w:rPr>
-        <w:t xml:space="preserve"> does in their </w:t>
-      </w:r>
-      <w:proofErr w:type="gramStart"/>
-      <w:r>
-        <w:rPr>
-          <w:b/>
-          <w:bCs/>
-        </w:rPr>
-        <w:t>reads</w:t>
-      </w:r>
-      <w:proofErr w:type="gramEnd"/>
-      <w:r>
-        <w:rPr>
-          <w:b/>
-          <w:bCs/>
-        </w:rPr>
-        <w:t xml:space="preserve"> classification table</w:t>
+        <w:t>Could look at detecting different types of small rna species e.g., what tamirna does in their reads classification table</w:t>
       </w:r>
     </w:p>
     <w:p>
@@ -837,23 +706,7 @@
           <w:b/>
           <w:bCs/>
         </w:rPr>
-        <w:t xml:space="preserve">It is also possible that they are working agonistically because the target genes being targeted by upregulated are stimulatory and the downregulated ones are inhibitory </w:t>
-      </w:r>
-      <w:proofErr w:type="gramStart"/>
-      <w:r>
-        <w:rPr>
-          <w:b/>
-          <w:bCs/>
-        </w:rPr>
-        <w:t>therefore</w:t>
-      </w:r>
-      <w:proofErr w:type="gramEnd"/>
-      <w:r>
-        <w:rPr>
-          <w:b/>
-          <w:bCs/>
-        </w:rPr>
-        <w:t xml:space="preserve"> they are working in the same direction</w:t>
+        <w:t>It is also possible that they are working agonistically because the target genes being targeted by upregulated are stimulatory and the downregulated ones are inhibitory therefore they are working in the same direction</w:t>
       </w:r>
     </w:p>
     <w:p>
@@ -877,38 +730,14 @@
         </w:numPr>
       </w:pPr>
       <w:r>
-        <w:t>Why is RT-qPCR necessary if you already have small RNA-</w:t>
-      </w:r>
-      <w:proofErr w:type="spellStart"/>
-      <w:r>
-        <w:t>seq</w:t>
-      </w:r>
-      <w:proofErr w:type="spellEnd"/>
-      <w:r>
-        <w:t xml:space="preserve"> data? </w:t>
-      </w:r>
-      <w:r>
-        <w:rPr>
-          <w:b/>
-          <w:bCs/>
-        </w:rPr>
-        <w:t>Small RNA-</w:t>
-      </w:r>
-      <w:proofErr w:type="spellStart"/>
-      <w:r>
-        <w:rPr>
-          <w:b/>
-          <w:bCs/>
-        </w:rPr>
-        <w:t>seq</w:t>
-      </w:r>
-      <w:proofErr w:type="spellEnd"/>
-      <w:r>
-        <w:rPr>
-          <w:b/>
-          <w:bCs/>
-        </w:rPr>
-        <w:t xml:space="preserve"> is genome-wide whereas PCR is very specific. Using both methods reduces the risk that results were found due to technical artefacts.</w:t>
+        <w:t xml:space="preserve">Why is RT-qPCR necessary if you already have small RNA-seq data? </w:t>
+      </w:r>
+      <w:r>
+        <w:rPr>
+          <w:b/>
+          <w:bCs/>
+        </w:rPr>
+        <w:t>Small RNA-seq is genome-wide whereas PCR is very specific. Using both methods reduces the risk that results were found due to technical artefacts.</w:t>
       </w:r>
     </w:p>
     <w:p>
@@ -971,40 +800,15 @@
           <w:b/>
           <w:bCs/>
         </w:rPr>
-        <w:t xml:space="preserve">The greatest overall challenge was deciding what the project was </w:t>
-      </w:r>
-      <w:proofErr w:type="gramStart"/>
-      <w:r>
-        <w:rPr>
-          <w:b/>
-          <w:bCs/>
-        </w:rPr>
-        <w:t>actually about</w:t>
-      </w:r>
-      <w:proofErr w:type="gramEnd"/>
-      <w:r>
-        <w:rPr>
-          <w:b/>
-          <w:bCs/>
-        </w:rPr>
-        <w:t xml:space="preserve">. Because I received the data in a staggered way, the aim of the project kept changing based on the results of the data as I could no longer do what I set out to do. This is a good example of how projects can change over time and when you are doing stuff in a short </w:t>
-      </w:r>
-      <w:proofErr w:type="gramStart"/>
+        <w:t xml:space="preserve">The greatest overall challenge was deciding what the project was actually about. Because I received the data in a staggered way, the aim of the project kept changing based on the results of the data as I could no longer do what I set out to do. This is a good example of how projects can change over time and when you are doing stuff in a short </w:t>
+      </w:r>
       <w:r>
         <w:rPr>
           <w:b/>
           <w:bCs/>
         </w:rPr>
         <w:lastRenderedPageBreak/>
-        <w:t>time period</w:t>
-      </w:r>
-      <w:proofErr w:type="gramEnd"/>
-      <w:r>
-        <w:rPr>
-          <w:b/>
-          <w:bCs/>
-        </w:rPr>
-        <w:t>, you may not be able to reach the depth of analysis you might like to.</w:t>
+        <w:t>time period, you may not be able to reach the depth of analysis you might like to.</w:t>
       </w:r>
     </w:p>
     <w:p>
@@ -1091,15 +895,7 @@
         </w:numPr>
       </w:pPr>
       <w:r>
-        <w:t>How do you know WNT/NOTCH/</w:t>
-      </w:r>
-      <w:proofErr w:type="spellStart"/>
-      <w:r>
-        <w:t>RHOGTPase</w:t>
-      </w:r>
-      <w:proofErr w:type="spellEnd"/>
-      <w:r>
-        <w:t xml:space="preserve"> pathways are involved in epithelial barrier homeostasis? </w:t>
+        <w:t xml:space="preserve">How do you know WNT/NOTCH/RHOGTPase pathways are involved in epithelial barrier homeostasis? </w:t>
       </w:r>
       <w:r>
         <w:rPr>
@@ -1218,23 +1014,34 @@
           <w:b/>
           <w:bCs/>
         </w:rPr>
-        <w:t xml:space="preserve">Spike in controls were present in the sequencing data made available for me, but I </w:t>
-      </w:r>
-      <w:proofErr w:type="gramStart"/>
-      <w:r>
-        <w:rPr>
-          <w:b/>
-          <w:bCs/>
-        </w:rPr>
-        <w:t>was not able to</w:t>
-      </w:r>
-      <w:proofErr w:type="gramEnd"/>
-      <w:r>
-        <w:rPr>
-          <w:b/>
-          <w:bCs/>
-        </w:rPr>
-        <w:t xml:space="preserve"> use it due to the complexity of handling it. Because miRNA is a minor constituent of the sequencing library, there are likely going to be lots of lowly expressed miRNAs and therefore it is really important to improve the analysis of them</w:t>
+        <w:t>Spike in controls were present in the sequencing data made available for me, but I was not able to use it due to the complexity of handling it. Because miRNA is a minor constituent of the sequencing library, there are likely going to be lots of lowly expressed miRNAs and therefore it is really important to improve the analysis of them</w:t>
+      </w:r>
+    </w:p>
+    <w:p>
+      <w:pPr>
+        <w:pStyle w:val="ListParagraph"/>
+        <w:numPr>
+          <w:ilvl w:val="0"/>
+          <w:numId w:val="5"/>
+        </w:numPr>
+      </w:pPr>
+      <w:r>
+        <w:lastRenderedPageBreak/>
+        <w:t xml:space="preserve">How many different types of miRNA are there? </w:t>
+      </w:r>
+      <w:r>
+        <w:rPr>
+          <w:b/>
+          <w:bCs/>
+        </w:rPr>
+        <w:t>Around 1900 different ones</w:t>
+      </w:r>
+      <w:r>
+        <w:rPr>
+          <w:b/>
+          <w:bCs/>
+        </w:rPr>
+        <w:t xml:space="preserve"> (most of which are in the mirbase database).</w:t>
       </w:r>
     </w:p>
     <w:p/>

</xml_diff>

<commit_message>
ADDING TODAY'S WORK - 28.08.2026
</commit_message>
<xml_diff>
--- a/viva/viva_questions_plan.docx
+++ b/viva/viva_questions_plan.docx
@@ -258,12 +258,103 @@
       <w:pPr>
         <w:pStyle w:val="ListParagraph"/>
         <w:numPr>
-          <w:ilvl w:val="1"/>
+          <w:ilvl w:val="2"/>
           <w:numId w:val="8"/>
         </w:numPr>
       </w:pPr>
       <w:r>
         <w:rPr>
+          <w:b/>
+          <w:bCs/>
+        </w:rPr>
+        <w:t>I looked for</w:t>
+      </w:r>
+      <w:r>
+        <w:rPr>
+          <w:b/>
+          <w:bCs/>
+        </w:rPr>
+        <w:t xml:space="preserve"> existing</w:t>
+      </w:r>
+      <w:r>
+        <w:rPr>
+          <w:b/>
+          <w:bCs/>
+        </w:rPr>
+        <w:t xml:space="preserve"> miRNA differential expression analysis pipelines and performed a comparison of what tools they used to determine what I should use in my own workflow.</w:t>
+      </w:r>
+    </w:p>
+    <w:p>
+      <w:pPr>
+        <w:pStyle w:val="ListParagraph"/>
+        <w:numPr>
+          <w:ilvl w:val="2"/>
+          <w:numId w:val="8"/>
+        </w:numPr>
+      </w:pPr>
+      <w:r>
+        <w:rPr>
+          <w:b/>
+          <w:bCs/>
+        </w:rPr>
+        <w:lastRenderedPageBreak/>
+        <w:t xml:space="preserve">I intended to test many different </w:t>
+      </w:r>
+      <w:r>
+        <w:rPr>
+          <w:b/>
+          <w:bCs/>
+        </w:rPr>
+        <w:t xml:space="preserve">DE </w:t>
+      </w:r>
+      <w:r>
+        <w:rPr>
+          <w:b/>
+          <w:bCs/>
+        </w:rPr>
+        <w:t xml:space="preserve">software and compare the </w:t>
+      </w:r>
+      <w:r>
+        <w:rPr>
+          <w:b/>
+          <w:bCs/>
+        </w:rPr>
+        <w:t>results,</w:t>
+      </w:r>
+      <w:r>
+        <w:rPr>
+          <w:b/>
+          <w:bCs/>
+        </w:rPr>
+        <w:t xml:space="preserve"> but this wasn’t done because after my first attempt, I had comparable results to TAmiRNA.</w:t>
+      </w:r>
+    </w:p>
+    <w:p>
+      <w:pPr>
+        <w:pStyle w:val="ListParagraph"/>
+        <w:numPr>
+          <w:ilvl w:val="2"/>
+          <w:numId w:val="8"/>
+        </w:numPr>
+      </w:pPr>
+      <w:r>
+        <w:rPr>
+          <w:b/>
+          <w:bCs/>
+        </w:rPr>
+        <w:t>However, I did test many different methods for reducing the target gene list in target gene-level enrichment. This was a combination of looking at what other papers did and also looking at the filtering options in commercial software (e.g., QIAGEN IPA) and try to replicate it using open-access resources.</w:t>
+      </w:r>
+    </w:p>
+    <w:p>
+      <w:pPr>
+        <w:pStyle w:val="ListParagraph"/>
+        <w:numPr>
+          <w:ilvl w:val="1"/>
+          <w:numId w:val="8"/>
+        </w:numPr>
+      </w:pPr>
+      <w:r>
+        <w:rPr>
           <w:lang w:val="en-IE"/>
         </w:rPr>
         <w:t>The scope and limits of your data collection</w:t>
@@ -273,12 +364,71 @@
       <w:pPr>
         <w:pStyle w:val="ListParagraph"/>
         <w:numPr>
-          <w:ilvl w:val="1"/>
+          <w:ilvl w:val="2"/>
           <w:numId w:val="8"/>
         </w:numPr>
       </w:pPr>
       <w:r>
         <w:rPr>
+          <w:b/>
+          <w:bCs/>
+          <w:lang w:val="en-IE"/>
+        </w:rPr>
+        <w:t>Data was collected from two studies that had been performed within the same lab and they differed in cell type and allergen.</w:t>
+      </w:r>
+    </w:p>
+    <w:p>
+      <w:pPr>
+        <w:pStyle w:val="ListParagraph"/>
+        <w:numPr>
+          <w:ilvl w:val="2"/>
+          <w:numId w:val="8"/>
+        </w:numPr>
+      </w:pPr>
+      <w:r>
+        <w:rPr>
+          <w:b/>
+          <w:bCs/>
+          <w:lang w:val="en-IE"/>
+        </w:rPr>
+        <w:t>Only 3 replicates were used so we had to use the results from these no matter what to be statistically reliable – this meant that technical artefacts and outliers could not be accounted for.</w:t>
+      </w:r>
+    </w:p>
+    <w:p>
+      <w:pPr>
+        <w:pStyle w:val="ListParagraph"/>
+        <w:numPr>
+          <w:ilvl w:val="2"/>
+          <w:numId w:val="8"/>
+        </w:numPr>
+      </w:pPr>
+      <w:r>
+        <w:rPr>
+          <w:b/>
+          <w:bCs/>
+          <w:lang w:val="en-IE"/>
+        </w:rPr>
+        <w:t>Money was a big limiter in determining how many samples could be analysed – primary cells are expensive and the transcriptomics was very expensive (£12,000).</w:t>
+      </w:r>
+      <w:r>
+        <w:rPr>
+          <w:b/>
+          <w:bCs/>
+          <w:lang w:val="en-IE"/>
+        </w:rPr>
+        <w:t xml:space="preserve"> </w:t>
+      </w:r>
+    </w:p>
+    <w:p>
+      <w:pPr>
+        <w:pStyle w:val="ListParagraph"/>
+        <w:numPr>
+          <w:ilvl w:val="1"/>
+          <w:numId w:val="8"/>
+        </w:numPr>
+      </w:pPr>
+      <w:r>
+        <w:rPr>
           <w:lang w:val="en-IE"/>
         </w:rPr>
         <w:t>Whether there were any problems with the data collection process</w:t>
@@ -288,15 +438,149 @@
       <w:pPr>
         <w:pStyle w:val="ListParagraph"/>
         <w:numPr>
-          <w:ilvl w:val="1"/>
+          <w:ilvl w:val="2"/>
           <w:numId w:val="8"/>
         </w:numPr>
       </w:pPr>
       <w:r>
         <w:rPr>
+          <w:b/>
+          <w:bCs/>
+          <w:lang w:val="en-IE"/>
+        </w:rPr>
+        <w:t>I was concerned that the amount of miRNA extracted from the EVs was too small to get reliable differential expression.</w:t>
+      </w:r>
+    </w:p>
+    <w:p>
+      <w:pPr>
+        <w:pStyle w:val="ListParagraph"/>
+        <w:numPr>
+          <w:ilvl w:val="2"/>
+          <w:numId w:val="8"/>
+        </w:numPr>
+      </w:pPr>
+      <w:r>
+        <w:rPr>
+          <w:b/>
+          <w:bCs/>
+          <w:lang w:val="en-IE"/>
+        </w:rPr>
+        <w:t>This is likely due to miRNA being only one of many different types of RNA that the EVs contain.</w:t>
+      </w:r>
+    </w:p>
+    <w:p>
+      <w:pPr>
+        <w:pStyle w:val="ListParagraph"/>
+        <w:numPr>
+          <w:ilvl w:val="2"/>
+          <w:numId w:val="8"/>
+        </w:numPr>
+      </w:pPr>
+      <w:r>
+        <w:rPr>
+          <w:b/>
+          <w:bCs/>
+          <w:lang w:val="en-IE"/>
+        </w:rPr>
+        <w:t xml:space="preserve">Furthermore, because EVs are produced more readily during inflammation, which is what we observed in the primary HBEC dataset, control samples had less miRNA and this meant that these samples may have been less robust, particularly for low -abundance miRNAs. </w:t>
+      </w:r>
+    </w:p>
+    <w:p>
+      <w:pPr>
+        <w:pStyle w:val="ListParagraph"/>
+        <w:numPr>
+          <w:ilvl w:val="2"/>
+          <w:numId w:val="8"/>
+        </w:numPr>
+      </w:pPr>
+      <w:r>
+        <w:rPr>
+          <w:b/>
+          <w:bCs/>
+          <w:lang w:val="en-IE"/>
+        </w:rPr>
+        <w:t xml:space="preserve">However, as they </w:t>
+      </w:r>
+      <w:r>
+        <w:rPr>
+          <w:b/>
+          <w:bCs/>
+          <w:lang w:val="en-IE"/>
+        </w:rPr>
+        <w:t>had to split the EVs between different forms of analyses</w:t>
+      </w:r>
+      <w:r>
+        <w:rPr>
+          <w:b/>
+          <w:bCs/>
+          <w:lang w:val="en-IE"/>
+        </w:rPr>
+        <w:t>,</w:t>
+      </w:r>
+      <w:r>
+        <w:rPr>
+          <w:b/>
+          <w:bCs/>
+          <w:lang w:val="en-IE"/>
+        </w:rPr>
+        <w:t xml:space="preserve"> which diluted </w:t>
+      </w:r>
+      <w:r>
+        <w:rPr>
+          <w:b/>
+          <w:bCs/>
+          <w:lang w:val="en-IE"/>
+        </w:rPr>
+        <w:t>them, I am unsure how many they had to begin with.</w:t>
+      </w:r>
+    </w:p>
+    <w:p>
+      <w:pPr>
+        <w:pStyle w:val="ListParagraph"/>
+        <w:numPr>
+          <w:ilvl w:val="1"/>
+          <w:numId w:val="8"/>
+        </w:numPr>
+      </w:pPr>
+      <w:r>
+        <w:rPr>
           <w:lang w:val="en-IE"/>
         </w:rPr>
         <w:t>The ethical issues you faced and how these were dealt with</w:t>
+      </w:r>
+    </w:p>
+    <w:p>
+      <w:pPr>
+        <w:pStyle w:val="ListParagraph"/>
+        <w:numPr>
+          <w:ilvl w:val="2"/>
+          <w:numId w:val="8"/>
+        </w:numPr>
+      </w:pPr>
+      <w:r>
+        <w:rPr>
+          <w:b/>
+          <w:bCs/>
+          <w:lang w:val="en-IE"/>
+        </w:rPr>
+        <w:t>Primary cells were used in the primary HBEC dataset therefore these had to be anonymised but metadata was provided.</w:t>
+      </w:r>
+    </w:p>
+    <w:p>
+      <w:pPr>
+        <w:pStyle w:val="ListParagraph"/>
+        <w:numPr>
+          <w:ilvl w:val="2"/>
+          <w:numId w:val="8"/>
+        </w:numPr>
+      </w:pPr>
+      <w:r>
+        <w:rPr>
+          <w:b/>
+          <w:bCs/>
+          <w:lang w:val="en-IE"/>
+        </w:rPr>
+        <w:t>No ethical issues with the Calu-3 dataset.</w:t>
       </w:r>
     </w:p>
     <w:p>
@@ -313,32 +597,394 @@
           <w:bCs/>
           <w:lang w:val="en-IE"/>
         </w:rPr>
+        <w:t>Analysis</w:t>
+      </w:r>
+    </w:p>
+    <w:p>
+      <w:pPr>
+        <w:pStyle w:val="ListParagraph"/>
+        <w:numPr>
+          <w:ilvl w:val="1"/>
+          <w:numId w:val="8"/>
+        </w:numPr>
+      </w:pPr>
+      <w:r>
+        <w:rPr>
+          <w:lang w:val="en-IE"/>
+        </w:rPr>
+        <w:t>What method of analysis you used and the problems you may have encountered</w:t>
+      </w:r>
+    </w:p>
+    <w:p>
+      <w:pPr>
+        <w:pStyle w:val="ListParagraph"/>
+        <w:numPr>
+          <w:ilvl w:val="2"/>
+          <w:numId w:val="8"/>
+        </w:numPr>
+        <w:rPr>
+          <w:b/>
+          <w:bCs/>
+        </w:rPr>
+      </w:pPr>
+      <w:r>
+        <w:rPr>
+          <w:b/>
+          <w:bCs/>
+          <w:lang w:val="en-IE"/>
+        </w:rPr>
+        <w:t>Trimming</w:t>
+      </w:r>
+      <w:r>
+        <w:rPr>
+          <w:b/>
+          <w:bCs/>
+          <w:lang w:val="en-IE"/>
+        </w:rPr>
+        <w:t>:</w:t>
+      </w:r>
+    </w:p>
+    <w:p>
+      <w:pPr>
+        <w:pStyle w:val="ListParagraph"/>
+        <w:numPr>
+          <w:ilvl w:val="3"/>
+          <w:numId w:val="8"/>
+        </w:numPr>
+        <w:rPr>
+          <w:b/>
+          <w:bCs/>
+        </w:rPr>
+      </w:pPr>
+      <w:r>
+        <w:rPr>
+          <w:b/>
+          <w:bCs/>
+          <w:lang w:val="en-IE"/>
+        </w:rPr>
         <w:lastRenderedPageBreak/>
-        <w:t>Analysis</w:t>
-      </w:r>
-    </w:p>
-    <w:p>
-      <w:pPr>
-        <w:pStyle w:val="ListParagraph"/>
-        <w:numPr>
-          <w:ilvl w:val="1"/>
+        <w:t>I had to find out what adapter was used (did this by looking at the overrepresented sequences then googling to see what adapter the sequence contained).</w:t>
+      </w:r>
+    </w:p>
+    <w:p>
+      <w:pPr>
+        <w:pStyle w:val="ListParagraph"/>
+        <w:numPr>
+          <w:ilvl w:val="3"/>
           <w:numId w:val="8"/>
         </w:numPr>
-      </w:pPr>
-      <w:r>
-        <w:rPr>
-          <w:lang w:val="en-IE"/>
-        </w:rPr>
-        <w:t>What method of analysis you used and the problems you may have encountered</w:t>
-      </w:r>
-    </w:p>
-    <w:p>
-      <w:pPr>
-        <w:pStyle w:val="ListParagraph"/>
-        <w:numPr>
-          <w:ilvl w:val="1"/>
+        <w:rPr>
+          <w:b/>
+          <w:bCs/>
+        </w:rPr>
+      </w:pPr>
+      <w:r>
+        <w:rPr>
+          <w:b/>
+          <w:bCs/>
+          <w:lang w:val="en-IE"/>
+        </w:rPr>
+        <w:t xml:space="preserve">Had to determine the correct read length for trimming – lots of pipelines use 17 </w:t>
+      </w:r>
+      <w:proofErr w:type="spellStart"/>
+      <w:r>
+        <w:rPr>
+          <w:b/>
+          <w:bCs/>
+          <w:lang w:val="en-IE"/>
+        </w:rPr>
+        <w:t>nt</w:t>
+      </w:r>
+      <w:proofErr w:type="spellEnd"/>
+      <w:r>
+        <w:rPr>
+          <w:b/>
+          <w:bCs/>
+          <w:lang w:val="en-IE"/>
+        </w:rPr>
+        <w:t>; I tested both 17 and 18 nt.</w:t>
+      </w:r>
+    </w:p>
+    <w:p>
+      <w:pPr>
+        <w:pStyle w:val="ListParagraph"/>
+        <w:numPr>
+          <w:ilvl w:val="2"/>
           <w:numId w:val="8"/>
         </w:numPr>
+        <w:rPr>
+          <w:b/>
+          <w:bCs/>
+        </w:rPr>
+      </w:pPr>
+      <w:r>
+        <w:rPr>
+          <w:b/>
+          <w:bCs/>
+          <w:lang w:val="en-IE"/>
+        </w:rPr>
+        <w:t>Differential expression:</w:t>
+      </w:r>
+    </w:p>
+    <w:p>
+      <w:pPr>
+        <w:pStyle w:val="ListParagraph"/>
+        <w:numPr>
+          <w:ilvl w:val="3"/>
+          <w:numId w:val="8"/>
+        </w:numPr>
+        <w:rPr>
+          <w:b/>
+          <w:bCs/>
+        </w:rPr>
+      </w:pPr>
+      <w:r>
+        <w:rPr>
+          <w:b/>
+          <w:bCs/>
+          <w:lang w:val="en-IE"/>
+        </w:rPr>
+        <w:t xml:space="preserve">I used the </w:t>
+      </w:r>
+      <w:r>
+        <w:rPr>
+          <w:b/>
+          <w:bCs/>
+          <w:lang w:val="en-IE"/>
+        </w:rPr>
+        <w:t>suggested quick-start</w:t>
+      </w:r>
+      <w:r>
+        <w:rPr>
+          <w:b/>
+          <w:bCs/>
+          <w:lang w:val="en-IE"/>
+        </w:rPr>
+        <w:t xml:space="preserve"> edgeR </w:t>
+      </w:r>
+      <w:r>
+        <w:rPr>
+          <w:b/>
+          <w:bCs/>
+          <w:lang w:val="en-IE"/>
+        </w:rPr>
+        <w:t>pipeline but other commands may be more applicable if the data changes in future studies.</w:t>
+      </w:r>
+    </w:p>
+    <w:p>
+      <w:pPr>
+        <w:pStyle w:val="ListParagraph"/>
+        <w:numPr>
+          <w:ilvl w:val="3"/>
+          <w:numId w:val="8"/>
+        </w:numPr>
+        <w:rPr>
+          <w:b/>
+          <w:bCs/>
+        </w:rPr>
+      </w:pPr>
+      <w:r>
+        <w:rPr>
+          <w:b/>
+          <w:bCs/>
+          <w:lang w:val="en-IE"/>
+        </w:rPr>
+        <w:t>I also observed other studies that altered slightly the filtering, using a combination of deseq2 filtering and edgeR filtering but I didn’t do this due to complexity and time constraints.</w:t>
+      </w:r>
+    </w:p>
+    <w:p>
+      <w:pPr>
+        <w:pStyle w:val="ListParagraph"/>
+        <w:numPr>
+          <w:ilvl w:val="2"/>
+          <w:numId w:val="8"/>
+        </w:numPr>
+        <w:rPr>
+          <w:b/>
+          <w:bCs/>
+        </w:rPr>
+      </w:pPr>
+      <w:r>
+        <w:rPr>
+          <w:b/>
+          <w:bCs/>
+          <w:lang w:val="en-IE"/>
+        </w:rPr>
+        <w:t>Pathway enrichment analysis:</w:t>
+      </w:r>
+    </w:p>
+    <w:p>
+      <w:pPr>
+        <w:pStyle w:val="ListParagraph"/>
+        <w:numPr>
+          <w:ilvl w:val="3"/>
+          <w:numId w:val="8"/>
+        </w:numPr>
+        <w:rPr>
+          <w:b/>
+          <w:bCs/>
+        </w:rPr>
+      </w:pPr>
+      <w:r>
+        <w:rPr>
+          <w:b/>
+          <w:bCs/>
+          <w:lang w:val="en-IE"/>
+        </w:rPr>
+        <w:t>Many different methods for this. Some studies used predicted targets but I didn’t want to do this (in part because there were already so many experimentally validated ones).</w:t>
+      </w:r>
+    </w:p>
+    <w:p>
+      <w:pPr>
+        <w:pStyle w:val="ListParagraph"/>
+        <w:numPr>
+          <w:ilvl w:val="3"/>
+          <w:numId w:val="8"/>
+        </w:numPr>
+        <w:rPr>
+          <w:b/>
+          <w:bCs/>
+        </w:rPr>
+      </w:pPr>
+      <w:r>
+        <w:rPr>
+          <w:b/>
+          <w:bCs/>
+          <w:lang w:val="en-IE"/>
+        </w:rPr>
+        <w:t>Attempted many different techniques to reduce target gene list size but they all had serious drawbacks.</w:t>
+      </w:r>
+    </w:p>
+    <w:p>
+      <w:pPr>
+        <w:pStyle w:val="ListParagraph"/>
+        <w:numPr>
+          <w:ilvl w:val="3"/>
+          <w:numId w:val="8"/>
+        </w:numPr>
+        <w:rPr>
+          <w:b/>
+          <w:bCs/>
+        </w:rPr>
+      </w:pPr>
+      <w:r>
+        <w:rPr>
+          <w:b/>
+          <w:bCs/>
+          <w:lang w:val="en-IE"/>
+        </w:rPr>
+        <w:t>Network-based enrichment approaches applied arbitrary filters which I didn’t feel comfortable with.</w:t>
+      </w:r>
+    </w:p>
+    <w:p>
+      <w:pPr>
+        <w:pStyle w:val="ListParagraph"/>
+        <w:numPr>
+          <w:ilvl w:val="3"/>
+          <w:numId w:val="8"/>
+        </w:numPr>
+        <w:rPr>
+          <w:b/>
+          <w:bCs/>
+        </w:rPr>
+      </w:pPr>
+      <w:r>
+        <w:rPr>
+          <w:b/>
+          <w:bCs/>
+          <w:lang w:val="en-IE"/>
+        </w:rPr>
+        <w:t xml:space="preserve">Some good websites for this (DIANA) were not available when I was trying to do the study, as well as the server for </w:t>
+      </w:r>
+      <w:proofErr w:type="spellStart"/>
+      <w:r>
+        <w:rPr>
+          <w:b/>
+          <w:bCs/>
+          <w:lang w:val="en-IE"/>
+        </w:rPr>
+        <w:t>miEAA</w:t>
+      </w:r>
+      <w:proofErr w:type="spellEnd"/>
+      <w:r>
+        <w:rPr>
+          <w:b/>
+          <w:bCs/>
+          <w:lang w:val="en-IE"/>
+        </w:rPr>
+        <w:t xml:space="preserve"> 2.0 was also down for a substantial portion of the study, and also the HPC was down for a while as well.</w:t>
+      </w:r>
+    </w:p>
+    <w:p>
+      <w:pPr>
+        <w:pStyle w:val="ListParagraph"/>
+        <w:numPr>
+          <w:ilvl w:val="2"/>
+          <w:numId w:val="8"/>
+        </w:numPr>
+        <w:rPr>
+          <w:b/>
+          <w:bCs/>
+        </w:rPr>
+      </w:pPr>
+      <w:r>
+        <w:rPr>
+          <w:b/>
+          <w:bCs/>
+          <w:lang w:val="en-IE"/>
+        </w:rPr>
+        <w:t>Literature search:</w:t>
+      </w:r>
+    </w:p>
+    <w:p>
+      <w:pPr>
+        <w:pStyle w:val="ListParagraph"/>
+        <w:numPr>
+          <w:ilvl w:val="3"/>
+          <w:numId w:val="8"/>
+        </w:numPr>
+        <w:rPr>
+          <w:b/>
+          <w:bCs/>
+        </w:rPr>
+      </w:pPr>
+      <w:r>
+        <w:rPr>
+          <w:b/>
+          <w:bCs/>
+          <w:lang w:val="en-IE"/>
+        </w:rPr>
+        <w:t>Key words were not exhaustive so publications may have been missed/overlooked</w:t>
+      </w:r>
+    </w:p>
+    <w:p>
+      <w:pPr>
+        <w:pStyle w:val="ListParagraph"/>
+        <w:numPr>
+          <w:ilvl w:val="3"/>
+          <w:numId w:val="8"/>
+        </w:numPr>
+        <w:rPr>
+          <w:b/>
+          <w:bCs/>
+        </w:rPr>
+      </w:pPr>
+      <w:r>
+        <w:rPr>
+          <w:b/>
+          <w:bCs/>
+          <w:lang w:val="en-IE"/>
+        </w:rPr>
+        <w:t>Could not detect novel pathways using this method.</w:t>
+      </w:r>
+    </w:p>
+    <w:p>
+      <w:pPr>
+        <w:pStyle w:val="ListParagraph"/>
+        <w:numPr>
+          <w:ilvl w:val="1"/>
+          <w:numId w:val="8"/>
+        </w:numPr>
       </w:pPr>
       <w:r>
         <w:rPr>
@@ -347,6 +993,41 @@
         <w:t>Whether you feel the data you collected answered your research question</w:t>
       </w:r>
     </w:p>
+    <w:p>
+      <w:pPr>
+        <w:pStyle w:val="ListParagraph"/>
+        <w:numPr>
+          <w:ilvl w:val="2"/>
+          <w:numId w:val="8"/>
+        </w:numPr>
+      </w:pPr>
+      <w:r>
+        <w:rPr>
+          <w:b/>
+          <w:bCs/>
+          <w:lang w:val="en-IE"/>
+        </w:rPr>
+        <w:t>Not alone – I would want more experimental data (samples/donors) to verify the results.</w:t>
+      </w:r>
+    </w:p>
+    <w:p>
+      <w:pPr>
+        <w:pStyle w:val="ListParagraph"/>
+        <w:numPr>
+          <w:ilvl w:val="2"/>
+          <w:numId w:val="8"/>
+        </w:numPr>
+      </w:pPr>
+      <w:r>
+        <w:rPr>
+          <w:b/>
+          <w:bCs/>
+          <w:lang w:val="en-IE"/>
+        </w:rPr>
+        <w:t xml:space="preserve">There was too much variability between replicates (individual replicates driving observations) to be sure they were real observations. </w:t>
+      </w:r>
+    </w:p>
+    <w:p/>
     <w:p>
       <w:pPr>
         <w:pStyle w:val="ListParagraph"/>
@@ -383,12 +1064,81 @@
       <w:pPr>
         <w:pStyle w:val="ListParagraph"/>
         <w:numPr>
-          <w:ilvl w:val="1"/>
+          <w:ilvl w:val="2"/>
           <w:numId w:val="8"/>
         </w:numPr>
       </w:pPr>
       <w:r>
         <w:rPr>
+          <w:b/>
+          <w:bCs/>
+          <w:lang w:val="en-IE"/>
+        </w:rPr>
+        <w:lastRenderedPageBreak/>
+        <w:t>Target gene-level enrichment more informative than miRNA-level</w:t>
+      </w:r>
+    </w:p>
+    <w:p>
+      <w:pPr>
+        <w:pStyle w:val="ListParagraph"/>
+        <w:numPr>
+          <w:ilvl w:val="2"/>
+          <w:numId w:val="8"/>
+        </w:numPr>
+      </w:pPr>
+      <w:r>
+        <w:rPr>
+          <w:b/>
+          <w:bCs/>
+          <w:lang w:val="en-IE"/>
+        </w:rPr>
+        <w:t>Biologically plausible pathways detected in primary HBEC dataset</w:t>
+      </w:r>
+    </w:p>
+    <w:p>
+      <w:pPr>
+        <w:pStyle w:val="ListParagraph"/>
+        <w:numPr>
+          <w:ilvl w:val="2"/>
+          <w:numId w:val="8"/>
+        </w:numPr>
+      </w:pPr>
+      <w:r>
+        <w:rPr>
+          <w:b/>
+          <w:bCs/>
+          <w:lang w:val="en-IE"/>
+        </w:rPr>
+        <w:t>Calu-3 dataset was underpowered, likely due to limited miRNA abundance, borne of inappropriate experimental design</w:t>
+      </w:r>
+    </w:p>
+    <w:p>
+      <w:pPr>
+        <w:pStyle w:val="ListParagraph"/>
+        <w:numPr>
+          <w:ilvl w:val="2"/>
+          <w:numId w:val="8"/>
+        </w:numPr>
+      </w:pPr>
+      <w:r>
+        <w:rPr>
+          <w:b/>
+          <w:bCs/>
+          <w:lang w:val="en-IE"/>
+        </w:rPr>
+        <w:t>Results could be improved by better filtering target gene lists</w:t>
+      </w:r>
+    </w:p>
+    <w:p>
+      <w:pPr>
+        <w:pStyle w:val="ListParagraph"/>
+        <w:numPr>
+          <w:ilvl w:val="1"/>
+          <w:numId w:val="8"/>
+        </w:numPr>
+      </w:pPr>
+      <w:r>
+        <w:rPr>
           <w:lang w:val="en-IE"/>
         </w:rPr>
         <w:t>How you interpret your findings</w:t>
@@ -398,12 +1148,128 @@
       <w:pPr>
         <w:pStyle w:val="ListParagraph"/>
         <w:numPr>
-          <w:ilvl w:val="1"/>
+          <w:ilvl w:val="2"/>
           <w:numId w:val="8"/>
         </w:numPr>
       </w:pPr>
       <w:r>
         <w:rPr>
+          <w:b/>
+          <w:bCs/>
+          <w:lang w:val="en-IE"/>
+        </w:rPr>
+        <w:t>Cautiously!</w:t>
+      </w:r>
+    </w:p>
+    <w:p>
+      <w:pPr>
+        <w:pStyle w:val="ListParagraph"/>
+        <w:numPr>
+          <w:ilvl w:val="2"/>
+          <w:numId w:val="8"/>
+        </w:numPr>
+        <w:rPr>
+          <w:b/>
+          <w:bCs/>
+        </w:rPr>
+      </w:pPr>
+      <w:r>
+        <w:rPr>
+          <w:b/>
+          <w:bCs/>
+        </w:rPr>
+        <w:t>Primary HBEC results should be interpreted as exploratory rather than reliable as I am not confident in the differentially expressed miRNAs that were detected (due to donor effects and miRNA abundance) or in the pathways detected due to incomplete filtering of target gene lists.</w:t>
+      </w:r>
+      <w:r>
+        <w:rPr>
+          <w:b/>
+          <w:bCs/>
+        </w:rPr>
+        <w:t xml:space="preserve"> However, some of the pathways detected may be real.</w:t>
+      </w:r>
+    </w:p>
+    <w:p>
+      <w:pPr>
+        <w:pStyle w:val="ListParagraph"/>
+        <w:numPr>
+          <w:ilvl w:val="2"/>
+          <w:numId w:val="8"/>
+        </w:numPr>
+        <w:rPr>
+          <w:b/>
+          <w:bCs/>
+        </w:rPr>
+      </w:pPr>
+      <w:r>
+        <w:rPr>
+          <w:b/>
+          <w:bCs/>
+        </w:rPr>
+        <w:t xml:space="preserve">Calu-3 dataset can be confidently determined as lacking miRNA abundance as this was verified with </w:t>
+      </w:r>
+      <w:proofErr w:type="spellStart"/>
+      <w:r>
+        <w:rPr>
+          <w:b/>
+          <w:bCs/>
+        </w:rPr>
+        <w:t>miRTrace</w:t>
+      </w:r>
+      <w:proofErr w:type="spellEnd"/>
+      <w:r>
+        <w:rPr>
+          <w:b/>
+          <w:bCs/>
+        </w:rPr>
+        <w:t xml:space="preserve"> and by the reads mapped to sequences in </w:t>
+      </w:r>
+      <w:proofErr w:type="spellStart"/>
+      <w:r>
+        <w:rPr>
+          <w:b/>
+          <w:bCs/>
+        </w:rPr>
+        <w:t>miRBase</w:t>
+      </w:r>
+      <w:proofErr w:type="spellEnd"/>
+      <w:r>
+        <w:rPr>
+          <w:b/>
+          <w:bCs/>
+        </w:rPr>
+        <w:t>. However, differential expression analysis should be considered less than exploratory and therefore the literature search was not relevant.</w:t>
+      </w:r>
+    </w:p>
+    <w:p>
+      <w:pPr>
+        <w:pStyle w:val="ListParagraph"/>
+        <w:numPr>
+          <w:ilvl w:val="2"/>
+          <w:numId w:val="8"/>
+        </w:numPr>
+        <w:rPr>
+          <w:b/>
+          <w:bCs/>
+        </w:rPr>
+      </w:pPr>
+      <w:r>
+        <w:rPr>
+          <w:b/>
+          <w:bCs/>
+        </w:rPr>
+        <w:t>Pathway analysis is only hypothetical and not causal at the best of times. All results need experimentally validating.</w:t>
+      </w:r>
+    </w:p>
+    <w:p>
+      <w:pPr>
+        <w:pStyle w:val="ListParagraph"/>
+        <w:numPr>
+          <w:ilvl w:val="1"/>
+          <w:numId w:val="8"/>
+        </w:numPr>
+      </w:pPr>
+      <w:r>
+        <w:rPr>
           <w:lang w:val="en-IE"/>
         </w:rPr>
         <w:t>What you think makes your research original</w:t>
@@ -413,9 +1279,43 @@
       <w:pPr>
         <w:pStyle w:val="ListParagraph"/>
         <w:numPr>
-          <w:ilvl w:val="1"/>
+          <w:ilvl w:val="2"/>
           <w:numId w:val="8"/>
         </w:numPr>
+        <w:rPr>
+          <w:b/>
+          <w:bCs/>
+        </w:rPr>
+      </w:pPr>
+      <w:r>
+        <w:rPr>
+          <w:b/>
+          <w:bCs/>
+        </w:rPr>
+        <w:t xml:space="preserve">Using open-access software. </w:t>
+      </w:r>
+      <w:r>
+        <w:rPr>
+          <w:b/>
+          <w:bCs/>
+        </w:rPr>
+        <w:t>The aim was to allow none-bioinformaticians to perform this analysis in future.</w:t>
+      </w:r>
+      <w:r>
+        <w:rPr>
+          <w:b/>
+          <w:bCs/>
+        </w:rPr>
+        <w:t xml:space="preserve"> However, this turned out to be challenging due to the benefits commercial platforms present regarding filtering options.</w:t>
+      </w:r>
+    </w:p>
+    <w:p>
+      <w:pPr>
+        <w:pStyle w:val="ListParagraph"/>
+        <w:numPr>
+          <w:ilvl w:val="1"/>
+          <w:numId w:val="8"/>
+        </w:numPr>
       </w:pPr>
       <w:r>
         <w:rPr>
@@ -428,9 +1328,30 @@
       <w:pPr>
         <w:pStyle w:val="ListParagraph"/>
         <w:numPr>
-          <w:ilvl w:val="1"/>
+          <w:ilvl w:val="2"/>
           <w:numId w:val="8"/>
         </w:numPr>
+        <w:rPr>
+          <w:b/>
+          <w:bCs/>
+        </w:rPr>
+      </w:pPr>
+      <w:r>
+        <w:rPr>
+          <w:b/>
+          <w:bCs/>
+          <w:lang w:val="en-IE"/>
+        </w:rPr>
+        <w:t>Can you please expand on ‘issues’?</w:t>
+      </w:r>
+    </w:p>
+    <w:p>
+      <w:pPr>
+        <w:pStyle w:val="ListParagraph"/>
+        <w:numPr>
+          <w:ilvl w:val="1"/>
+          <w:numId w:val="8"/>
+        </w:numPr>
       </w:pPr>
       <w:r>
         <w:rPr>
@@ -443,15 +1364,166 @@
       <w:pPr>
         <w:pStyle w:val="ListParagraph"/>
         <w:numPr>
-          <w:ilvl w:val="1"/>
+          <w:ilvl w:val="2"/>
           <w:numId w:val="8"/>
         </w:numPr>
       </w:pPr>
       <w:r>
         <w:rPr>
+          <w:b/>
+          <w:bCs/>
+          <w:lang w:val="en-IE"/>
+        </w:rPr>
+        <w:t>Really want to be able to apply context-specific filtering. I looked for gene expression datasets for airway cells but there were so many, including immune cells that it didn’t actually reduce the gene list much.</w:t>
+      </w:r>
+    </w:p>
+    <w:p>
+      <w:pPr>
+        <w:pStyle w:val="ListParagraph"/>
+        <w:numPr>
+          <w:ilvl w:val="2"/>
+          <w:numId w:val="8"/>
+        </w:numPr>
+      </w:pPr>
+      <w:r>
+        <w:rPr>
+          <w:b/>
+          <w:bCs/>
+          <w:lang w:val="en-IE"/>
+        </w:rPr>
+        <w:t>Want to validate my workflow against other available pipelines and on other datasets.</w:t>
+      </w:r>
+    </w:p>
+    <w:p>
+      <w:pPr>
+        <w:pStyle w:val="ListParagraph"/>
+        <w:numPr>
+          <w:ilvl w:val="2"/>
+          <w:numId w:val="8"/>
+        </w:numPr>
+      </w:pPr>
+      <w:r>
+        <w:rPr>
+          <w:b/>
+          <w:bCs/>
+          <w:lang w:val="en-IE"/>
+        </w:rPr>
+        <w:t>Want to formally compare my results to TAmiRNA.</w:t>
+      </w:r>
+    </w:p>
+    <w:p>
+      <w:pPr>
+        <w:pStyle w:val="ListParagraph"/>
+        <w:numPr>
+          <w:ilvl w:val="2"/>
+          <w:numId w:val="8"/>
+        </w:numPr>
+      </w:pPr>
+      <w:r>
+        <w:rPr>
+          <w:b/>
+          <w:bCs/>
+          <w:lang w:val="en-IE"/>
+        </w:rPr>
+        <w:t>Want to make the workflow incredibly user-friendly</w:t>
+      </w:r>
+      <w:r>
+        <w:rPr>
+          <w:b/>
+          <w:bCs/>
+          <w:lang w:val="en-IE"/>
+        </w:rPr>
+        <w:t xml:space="preserve"> for non-bioinformaticians</w:t>
+      </w:r>
+      <w:r>
+        <w:rPr>
+          <w:b/>
+          <w:bCs/>
+          <w:lang w:val="en-IE"/>
+        </w:rPr>
+        <w:t>, including</w:t>
+      </w:r>
+      <w:r>
+        <w:rPr>
+          <w:b/>
+          <w:bCs/>
+          <w:lang w:val="en-IE"/>
+        </w:rPr>
+        <w:t xml:space="preserve"> help buttons and tutorials.</w:t>
+      </w:r>
+    </w:p>
+    <w:p>
+      <w:pPr>
+        <w:pStyle w:val="ListParagraph"/>
+        <w:numPr>
+          <w:ilvl w:val="1"/>
+          <w:numId w:val="8"/>
+        </w:numPr>
+      </w:pPr>
+      <w:r>
+        <w:rPr>
           <w:lang w:val="en-IE"/>
         </w:rPr>
         <w:t>How others might use or develop your research</w:t>
+      </w:r>
+    </w:p>
+    <w:p>
+      <w:pPr>
+        <w:pStyle w:val="ListParagraph"/>
+        <w:numPr>
+          <w:ilvl w:val="2"/>
+          <w:numId w:val="8"/>
+        </w:numPr>
+      </w:pPr>
+      <w:r>
+        <w:rPr>
+          <w:b/>
+          <w:bCs/>
+          <w:lang w:val="en-IE"/>
+        </w:rPr>
+        <w:lastRenderedPageBreak/>
+        <w:t>Can be used to develop an in-house workflow to repeat miRNA differential expression analysis on similar datasets in the future to avoid costly outsourcing and commercial software.</w:t>
+      </w:r>
+    </w:p>
+    <w:p>
+      <w:pPr>
+        <w:pStyle w:val="ListParagraph"/>
+        <w:numPr>
+          <w:ilvl w:val="2"/>
+          <w:numId w:val="8"/>
+        </w:numPr>
+      </w:pPr>
+      <w:r>
+        <w:rPr>
+          <w:b/>
+          <w:bCs/>
+          <w:lang w:val="en-IE"/>
+        </w:rPr>
+        <w:t xml:space="preserve">Can be used to put more emphasis on </w:t>
+      </w:r>
+      <w:r>
+        <w:rPr>
+          <w:b/>
+          <w:bCs/>
+          <w:lang w:val="en-IE"/>
+        </w:rPr>
+        <w:t xml:space="preserve">interpreting results in the context of </w:t>
+      </w:r>
+      <w:r>
+        <w:rPr>
+          <w:b/>
+          <w:bCs/>
+          <w:lang w:val="en-IE"/>
+        </w:rPr>
+        <w:t>quality control</w:t>
+      </w:r>
+      <w:r>
+        <w:rPr>
+          <w:b/>
+          <w:bCs/>
+          <w:lang w:val="en-IE"/>
+        </w:rPr>
+        <w:t>. This has already been acknowledged for the Calu-3 publication.</w:t>
       </w:r>
     </w:p>
     <w:p/>
@@ -499,8 +1571,170 @@
           <w:b/>
           <w:bCs/>
         </w:rPr>
-        <w:t>in the local github folder but not pushed it</w:t>
-      </w:r>
+        <w:t xml:space="preserve">in the local </w:t>
+      </w:r>
+      <w:proofErr w:type="spellStart"/>
+      <w:r>
+        <w:rPr>
+          <w:b/>
+          <w:bCs/>
+        </w:rPr>
+        <w:t>github</w:t>
+      </w:r>
+      <w:proofErr w:type="spellEnd"/>
+      <w:r>
+        <w:rPr>
+          <w:b/>
+          <w:bCs/>
+        </w:rPr>
+        <w:t xml:space="preserve"> folder but not pushed it</w:t>
+      </w:r>
+    </w:p>
+    <w:p>
+      <w:pPr>
+        <w:pStyle w:val="ListParagraph"/>
+        <w:numPr>
+          <w:ilvl w:val="0"/>
+          <w:numId w:val="13"/>
+        </w:numPr>
+      </w:pPr>
+      <w:r>
+        <w:t xml:space="preserve">The discussion indicates that Fc receptor is supported by Browne et al., 2025 but the study does not mention it. </w:t>
+      </w:r>
+    </w:p>
+    <w:p>
+      <w:pPr>
+        <w:pStyle w:val="ListParagraph"/>
+        <w:numPr>
+          <w:ilvl w:val="1"/>
+          <w:numId w:val="13"/>
+        </w:numPr>
+        <w:rPr>
+          <w:b/>
+          <w:bCs/>
+        </w:rPr>
+      </w:pPr>
+      <w:r>
+        <w:rPr>
+          <w:b/>
+          <w:bCs/>
+        </w:rPr>
+        <w:t>The reference was misplaced; it should have been after IL-4 and IL-13</w:t>
+      </w:r>
+      <w:r>
+        <w:rPr>
+          <w:b/>
+          <w:bCs/>
+        </w:rPr>
+        <w:t xml:space="preserve"> and before Fc</w:t>
+      </w:r>
+      <w:r>
+        <w:rPr>
+          <w:b/>
+          <w:bCs/>
+        </w:rPr>
+        <w:t>.</w:t>
+      </w:r>
+    </w:p>
+    <w:p>
+      <w:pPr>
+        <w:pStyle w:val="ListParagraph"/>
+        <w:numPr>
+          <w:ilvl w:val="1"/>
+          <w:numId w:val="13"/>
+        </w:numPr>
+        <w:rPr>
+          <w:b/>
+          <w:bCs/>
+        </w:rPr>
+      </w:pPr>
+      <w:r>
+        <w:rPr>
+          <w:b/>
+          <w:bCs/>
+        </w:rPr>
+        <w:t>Hoped it wasn’t necessary to reference well-known information</w:t>
+      </w:r>
+      <w:r>
+        <w:rPr>
+          <w:b/>
+          <w:bCs/>
+        </w:rPr>
+        <w:t xml:space="preserve"> </w:t>
+      </w:r>
+      <w:r>
+        <w:rPr>
+          <w:b/>
+          <w:bCs/>
+        </w:rPr>
+        <w:t xml:space="preserve">(that was also in the results) </w:t>
+      </w:r>
+      <w:r>
+        <w:rPr>
+          <w:b/>
+          <w:bCs/>
+        </w:rPr>
+        <w:t>as ran out of time to add the reference.</w:t>
+      </w:r>
+    </w:p>
+    <w:p>
+      <w:pPr>
+        <w:pStyle w:val="ListParagraph"/>
+        <w:numPr>
+          <w:ilvl w:val="1"/>
+          <w:numId w:val="13"/>
+        </w:numPr>
+        <w:rPr>
+          <w:b/>
+          <w:bCs/>
+        </w:rPr>
+      </w:pPr>
+      <w:r>
+        <w:rPr>
+          <w:b/>
+          <w:bCs/>
+        </w:rPr>
+        <w:t xml:space="preserve">Browne et al., 2025 </w:t>
+      </w:r>
+      <w:r>
+        <w:rPr>
+          <w:b/>
+          <w:bCs/>
+        </w:rPr>
+        <w:t>does talk about Th2</w:t>
+      </w:r>
+      <w:r>
+        <w:rPr>
+          <w:b/>
+          <w:bCs/>
+        </w:rPr>
+        <w:t>, TNF and TGF-</w:t>
+      </w:r>
+      <w:r>
+        <w:rPr>
+          <w:rFonts w:ascii="Aptos" w:hAnsi="Aptos"/>
+          <w:b/>
+          <w:bCs/>
+        </w:rPr>
+        <w:t>ß</w:t>
+      </w:r>
+      <w:r>
+        <w:rPr>
+          <w:b/>
+          <w:bCs/>
+        </w:rPr>
+        <w:t>.</w:t>
+      </w:r>
+    </w:p>
+    <w:p>
+      <w:pPr>
+        <w:pStyle w:val="ListParagraph"/>
+        <w:ind w:left="1440"/>
+        <w:rPr>
+          <w:b/>
+          <w:bCs/>
+        </w:rPr>
+      </w:pPr>
     </w:p>
     <w:p/>
     <w:p>
@@ -521,6 +1755,25 @@
         </w:numPr>
       </w:pPr>
       <w:r>
+        <w:t xml:space="preserve">What is the difference between immune and inflammatory? </w:t>
+      </w:r>
+      <w:r>
+        <w:rPr>
+          <w:b/>
+          <w:bCs/>
+        </w:rPr>
+        <w:t>Inflammatory is the more broad response that happens straight away (innate response) where it recruits lots of different immune cells to the area whereas immune is the more specialised response (innate and adaptive).</w:t>
+      </w:r>
+    </w:p>
+    <w:p>
+      <w:pPr>
+        <w:pStyle w:val="ListParagraph"/>
+        <w:numPr>
+          <w:ilvl w:val="0"/>
+          <w:numId w:val="5"/>
+        </w:numPr>
+      </w:pPr>
+      <w:r>
         <w:t xml:space="preserve">Why did you only perform ORA during target-gene enrichment but you performed ORA and miRNA-SEA at miRNA-level? </w:t>
       </w:r>
     </w:p>
@@ -537,7 +1790,69 @@
           <w:b/>
           <w:bCs/>
         </w:rPr>
-        <w:t>Could have used gsePathway()…</w:t>
+        <w:t xml:space="preserve">This was because very few results were obtained using ORA for miRNA-level and therefore I wanted to see whether miRNA-SEA would reveal any additional pathways. </w:t>
+      </w:r>
+    </w:p>
+    <w:p>
+      <w:pPr>
+        <w:pStyle w:val="ListParagraph"/>
+        <w:numPr>
+          <w:ilvl w:val="1"/>
+          <w:numId w:val="5"/>
+        </w:numPr>
+      </w:pPr>
+      <w:r>
+        <w:rPr>
+          <w:b/>
+          <w:bCs/>
+        </w:rPr>
+        <w:t>Target gene-level already had lots of significantly enriched pathways therefore I didn’t want to overcomplicate the results.</w:t>
+      </w:r>
+    </w:p>
+    <w:p>
+      <w:pPr>
+        <w:pStyle w:val="ListParagraph"/>
+        <w:numPr>
+          <w:ilvl w:val="1"/>
+          <w:numId w:val="5"/>
+        </w:numPr>
+      </w:pPr>
+      <w:r>
+        <w:rPr>
+          <w:b/>
+          <w:bCs/>
+        </w:rPr>
+        <w:t>I did consider using miRNA-SEA for target gene-level (c</w:t>
+      </w:r>
+      <w:r>
+        <w:rPr>
+          <w:b/>
+          <w:bCs/>
+        </w:rPr>
+        <w:t xml:space="preserve">ould have used </w:t>
+      </w:r>
+      <w:proofErr w:type="spellStart"/>
+      <w:r>
+        <w:rPr>
+          <w:b/>
+          <w:bCs/>
+        </w:rPr>
+        <w:t>gsePathway</w:t>
+      </w:r>
+      <w:proofErr w:type="spellEnd"/>
+      <w:r>
+        <w:rPr>
+          <w:b/>
+          <w:bCs/>
+        </w:rPr>
+        <w:t>()</w:t>
+      </w:r>
+      <w:r>
+        <w:rPr>
+          <w:b/>
+          <w:bCs/>
+        </w:rPr>
+        <w:t>) in the context of comparing the results however this was not done to save time and because the results section was already comprehensive.</w:t>
       </w:r>
     </w:p>
     <w:p>
@@ -549,6 +1864,7 @@
         </w:numPr>
       </w:pPr>
       <w:r>
+        <w:lastRenderedPageBreak/>
         <w:t>miRNA-level ORA may not have shown many significant pathways for the reasons set out in the discussion section but also because the background list of miRNAs (those observed in the experiment – kept after edgeR filtering) might not have been large enough?</w:t>
       </w:r>
     </w:p>
@@ -561,15 +1877,170 @@
         </w:numPr>
       </w:pPr>
       <w:r>
-        <w:t xml:space="preserve">Why did you use a higher significance threshold for miRNA-level enrichment (Padj &lt; 0.05) over target gene (Padj &lt; 0.02)? </w:t>
-      </w:r>
-      <w:r>
-        <w:rPr>
-          <w:b/>
-          <w:bCs/>
-        </w:rPr>
-        <w:t xml:space="preserve">Because there are fewer miRNA-pathway relationships and therefore there are likely to be fewer very significant pathways, so I didn’t want to miss anything by using a stricter threshold. Whereas, for target gene enrichment, the higher significance caused almost half of all </w:t>
-      </w:r>
+        <w:t>How did you come up with the background list for ORA?</w:t>
+      </w:r>
+    </w:p>
+    <w:p>
+      <w:pPr>
+        <w:pStyle w:val="ListParagraph"/>
+        <w:numPr>
+          <w:ilvl w:val="1"/>
+          <w:numId w:val="5"/>
+        </w:numPr>
+      </w:pPr>
+      <w:r>
+        <w:rPr>
+          <w:b/>
+          <w:bCs/>
+        </w:rPr>
+        <w:t xml:space="preserve">I tried multiple different types of background lists and found that these caused massive changes to the enriched pathways. </w:t>
+      </w:r>
+    </w:p>
+    <w:p>
+      <w:pPr>
+        <w:pStyle w:val="ListParagraph"/>
+        <w:numPr>
+          <w:ilvl w:val="1"/>
+          <w:numId w:val="5"/>
+        </w:numPr>
+      </w:pPr>
+      <w:r>
+        <w:rPr>
+          <w:b/>
+          <w:bCs/>
+        </w:rPr>
+        <w:t>For target gene-level enrichment, the background ended up being all genes in the genome because it was hard to reduce the amount of genes that could be targeted in the experiment as there was no experimental data.</w:t>
+      </w:r>
+    </w:p>
+    <w:p>
+      <w:pPr>
+        <w:pStyle w:val="ListParagraph"/>
+        <w:numPr>
+          <w:ilvl w:val="1"/>
+          <w:numId w:val="5"/>
+        </w:numPr>
+      </w:pPr>
+      <w:r>
+        <w:rPr>
+          <w:b/>
+          <w:bCs/>
+        </w:rPr>
+        <w:t xml:space="preserve">I attempted to create a background list of the genes expressed in airway cells and immune </w:t>
+      </w:r>
+      <w:r>
+        <w:rPr>
+          <w:b/>
+          <w:bCs/>
+        </w:rPr>
+        <w:t>cells,</w:t>
+      </w:r>
+      <w:r>
+        <w:rPr>
+          <w:b/>
+          <w:bCs/>
+        </w:rPr>
+        <w:t xml:space="preserve"> but the list of potential cells was massive and comprised the majority of the genome anyway.</w:t>
+      </w:r>
+    </w:p>
+    <w:p>
+      <w:pPr>
+        <w:pStyle w:val="ListParagraph"/>
+        <w:numPr>
+          <w:ilvl w:val="1"/>
+          <w:numId w:val="5"/>
+        </w:numPr>
+      </w:pPr>
+      <w:r>
+        <w:rPr>
+          <w:b/>
+          <w:bCs/>
+        </w:rPr>
+        <w:t>One source suggested using only those observed in the experiment which is the ones retained after edgeR filtering because the ones filtered out are likely noise/erroneous/unreliable.</w:t>
+      </w:r>
+    </w:p>
+    <w:p>
+      <w:pPr>
+        <w:pStyle w:val="ListParagraph"/>
+        <w:numPr>
+          <w:ilvl w:val="0"/>
+          <w:numId w:val="5"/>
+        </w:numPr>
+      </w:pPr>
+      <w:r>
+        <w:t>Why did you use a higher significance threshold for miRNA-level enrichment (</w:t>
+      </w:r>
+      <w:proofErr w:type="spellStart"/>
+      <w:r>
+        <w:t>Padj</w:t>
+      </w:r>
+      <w:proofErr w:type="spellEnd"/>
+      <w:r>
+        <w:t xml:space="preserve"> &lt; 0.05) over target gene (</w:t>
+      </w:r>
+      <w:proofErr w:type="spellStart"/>
+      <w:r>
+        <w:t>Padj</w:t>
+      </w:r>
+      <w:proofErr w:type="spellEnd"/>
+      <w:r>
+        <w:t xml:space="preserve"> &lt; 0.02)? </w:t>
+      </w:r>
+    </w:p>
+    <w:p>
+      <w:pPr>
+        <w:pStyle w:val="ListParagraph"/>
+        <w:numPr>
+          <w:ilvl w:val="1"/>
+          <w:numId w:val="5"/>
+        </w:numPr>
+      </w:pPr>
+      <w:r>
+        <w:rPr>
+          <w:b/>
+          <w:bCs/>
+        </w:rPr>
+        <w:t>Originally, both methods were 0.05 but then there were so many target gene-level pathways that I needed a more stringent filter.</w:t>
+      </w:r>
+    </w:p>
+    <w:p>
+      <w:pPr>
+        <w:pStyle w:val="ListParagraph"/>
+        <w:numPr>
+          <w:ilvl w:val="1"/>
+          <w:numId w:val="5"/>
+        </w:numPr>
+      </w:pPr>
+      <w:r>
+        <w:rPr>
+          <w:b/>
+          <w:bCs/>
+        </w:rPr>
+        <w:t>Also, b</w:t>
+      </w:r>
+      <w:r>
+        <w:rPr>
+          <w:b/>
+          <w:bCs/>
+        </w:rPr>
+        <w:t xml:space="preserve">ecause there are fewer miRNA-pathway relationships and therefore there are likely to be fewer very significant pathways, so I didn’t want to miss anything by using a stricter threshold. </w:t>
+      </w:r>
+    </w:p>
+    <w:p>
+      <w:pPr>
+        <w:pStyle w:val="ListParagraph"/>
+        <w:numPr>
+          <w:ilvl w:val="1"/>
+          <w:numId w:val="5"/>
+        </w:numPr>
+      </w:pPr>
+      <w:r>
+        <w:rPr>
+          <w:b/>
+          <w:bCs/>
+        </w:rPr>
+        <w:t xml:space="preserve">Whereas, for target gene enrichment, the higher significance caused almost half of all </w:t>
+      </w:r>
+      <w:proofErr w:type="spellStart"/>
       <w:r>
         <w:rPr>
           <w:b/>
@@ -577,6 +2048,7 @@
         </w:rPr>
         <w:t>Reactome</w:t>
       </w:r>
+      <w:proofErr w:type="spellEnd"/>
       <w:r>
         <w:rPr>
           <w:b/>
@@ -626,24 +2098,204 @@
           <w:b/>
           <w:bCs/>
         </w:rPr>
+        <w:t xml:space="preserve">Could look at detecting different types of small </w:t>
+      </w:r>
+      <w:proofErr w:type="spellStart"/>
+      <w:r>
+        <w:rPr>
+          <w:b/>
+          <w:bCs/>
+        </w:rPr>
+        <w:t>rna</w:t>
+      </w:r>
+      <w:proofErr w:type="spellEnd"/>
+      <w:r>
+        <w:rPr>
+          <w:b/>
+          <w:bCs/>
+        </w:rPr>
+        <w:t xml:space="preserve"> species e.g., what </w:t>
+      </w:r>
+      <w:proofErr w:type="spellStart"/>
+      <w:r>
+        <w:rPr>
+          <w:b/>
+          <w:bCs/>
+        </w:rPr>
+        <w:t>tamirna</w:t>
+      </w:r>
+      <w:proofErr w:type="spellEnd"/>
+      <w:r>
+        <w:rPr>
+          <w:b/>
+          <w:bCs/>
+        </w:rPr>
+        <w:t xml:space="preserve"> does in their reads classification table</w:t>
+      </w:r>
+    </w:p>
+    <w:p>
+      <w:pPr>
+        <w:pStyle w:val="ListParagraph"/>
+        <w:numPr>
+          <w:ilvl w:val="1"/>
+          <w:numId w:val="5"/>
+        </w:numPr>
+      </w:pPr>
+      <w:r>
+        <w:rPr>
+          <w:b/>
+          <w:bCs/>
+        </w:rPr>
+        <w:t>Repeat the analysis with matched miRNA-mRNA data.</w:t>
+      </w:r>
+    </w:p>
+    <w:p>
+      <w:pPr>
+        <w:pStyle w:val="ListParagraph"/>
+        <w:numPr>
+          <w:ilvl w:val="0"/>
+          <w:numId w:val="5"/>
+        </w:numPr>
+      </w:pPr>
+      <w:r>
+        <w:t xml:space="preserve">Why does the low miRNA abundance in the Calu-3 dataset constrain differential expression analysis? </w:t>
+      </w:r>
+    </w:p>
+    <w:p>
+      <w:pPr>
+        <w:pStyle w:val="ListParagraph"/>
+        <w:numPr>
+          <w:ilvl w:val="1"/>
+          <w:numId w:val="5"/>
+        </w:numPr>
+      </w:pPr>
+      <w:r>
+        <w:rPr>
+          <w:b/>
+          <w:bCs/>
+        </w:rPr>
+        <w:t>Low statistical power as the differences in expression may seem inflated at lower counts</w:t>
+      </w:r>
+      <w:r>
+        <w:rPr>
+          <w:b/>
+          <w:bCs/>
+        </w:rPr>
+        <w:t>.</w:t>
+      </w:r>
+    </w:p>
+    <w:p>
+      <w:pPr>
+        <w:pStyle w:val="ListParagraph"/>
+        <w:numPr>
+          <w:ilvl w:val="1"/>
+          <w:numId w:val="5"/>
+        </w:numPr>
+      </w:pPr>
+      <w:r>
+        <w:rPr>
+          <w:b/>
+          <w:bCs/>
+        </w:rPr>
+        <w:t>M</w:t>
+      </w:r>
+      <w:r>
+        <w:rPr>
+          <w:b/>
+          <w:bCs/>
+        </w:rPr>
+        <w:t>ore miRNAs may be filtered by edgeR as they appear to not express the miRNA when they actually do which alters the statistical model, fails to capture the true transcriptome of the cells, [examples of more miRNA abundance being used/necessary]</w:t>
+      </w:r>
+    </w:p>
+    <w:p>
+      <w:pPr>
+        <w:pStyle w:val="ListParagraph"/>
+        <w:numPr>
+          <w:ilvl w:val="0"/>
+          <w:numId w:val="5"/>
+        </w:numPr>
+      </w:pPr>
+      <w:r>
         <w:lastRenderedPageBreak/>
-        <w:t>Could look at detecting different types of small rna species e.g., what tamirna does in their reads classification table</w:t>
-      </w:r>
-    </w:p>
-    <w:p>
-      <w:pPr>
-        <w:pStyle w:val="ListParagraph"/>
-        <w:numPr>
-          <w:ilvl w:val="1"/>
-          <w:numId w:val="5"/>
-        </w:numPr>
-      </w:pPr>
-      <w:r>
-        <w:rPr>
-          <w:b/>
-          <w:bCs/>
-        </w:rPr>
-        <w:t>Repeat the analysis with matched miRNA-mRNA data.</w:t>
+        <w:t xml:space="preserve">Why do the same pathways appear in both upregulated and downregulated DE miRNAs for target gene-level enrichment? </w:t>
+      </w:r>
+    </w:p>
+    <w:p>
+      <w:pPr>
+        <w:pStyle w:val="ListParagraph"/>
+        <w:numPr>
+          <w:ilvl w:val="1"/>
+          <w:numId w:val="5"/>
+        </w:numPr>
+      </w:pPr>
+      <w:r>
+        <w:rPr>
+          <w:b/>
+          <w:bCs/>
+        </w:rPr>
+        <w:t>It is possible that they’re working antagonistically which could be a bit odd or the miRNAs might not actually be acting on the target genes involved in the pathway because this is just a hypothesis and there isn’t matching mRNA data to identify miRNA-mRNA relationships</w:t>
+      </w:r>
+    </w:p>
+    <w:p>
+      <w:pPr>
+        <w:pStyle w:val="ListParagraph"/>
+        <w:numPr>
+          <w:ilvl w:val="1"/>
+          <w:numId w:val="5"/>
+        </w:numPr>
+      </w:pPr>
+      <w:r>
+        <w:rPr>
+          <w:b/>
+          <w:bCs/>
+        </w:rPr>
+        <w:t>It is also possible that they are working agonistically because the target genes being targeted by upregulated are stimulatory and the downregulated ones are inhibitory therefore they are working in the same direction</w:t>
+      </w:r>
+    </w:p>
+    <w:p>
+      <w:pPr>
+        <w:pStyle w:val="ListParagraph"/>
+        <w:numPr>
+          <w:ilvl w:val="1"/>
+          <w:numId w:val="5"/>
+        </w:numPr>
+      </w:pPr>
+      <w:r>
+        <w:rPr>
+          <w:b/>
+          <w:bCs/>
+        </w:rPr>
+        <w:t>It is also possible that they are not real associations and are instead noise due to the lack of appropriate target gene filtering.</w:t>
+      </w:r>
+    </w:p>
+    <w:p>
+      <w:pPr>
+        <w:pStyle w:val="ListParagraph"/>
+        <w:numPr>
+          <w:ilvl w:val="1"/>
+          <w:numId w:val="5"/>
+        </w:numPr>
+      </w:pPr>
+      <w:r>
+        <w:rPr>
+          <w:b/>
+          <w:bCs/>
+        </w:rPr>
+        <w:t xml:space="preserve">However, once you have matching </w:t>
+      </w:r>
+      <w:r>
+        <w:rPr>
+          <w:b/>
+          <w:bCs/>
+        </w:rPr>
+        <w:t>miRNA-mRNA relationships</w:t>
+      </w:r>
+      <w:r>
+        <w:rPr>
+          <w:b/>
+          <w:bCs/>
+        </w:rPr>
+        <w:t xml:space="preserve"> then this can be fed into software such as QIAGEN IPA and it will tell you how they all link together.</w:t>
       </w:r>
     </w:p>
     <w:p>
@@ -655,14 +2307,135 @@
         </w:numPr>
       </w:pPr>
       <w:r>
-        <w:t xml:space="preserve">Why does the low miRNA abundance in the Calu-3 dataset constrain differential expression analysis? </w:t>
-      </w:r>
-      <w:r>
-        <w:rPr>
-          <w:b/>
-          <w:bCs/>
-        </w:rPr>
-        <w:t>Low statistical power as the differences in expression may seem inflated at lower counts, more miRNAs may be filtered by edgeR as they appear to not express the miRNA when they actually do which alters the statistical model, fails to capture the true transcriptome of the cells, [examples of more miRNA abundance being used/necessary]</w:t>
+        <w:t>How do WNT and NOTCH regulate epithelial barrier integrity in the upregulated target gene pathways and RHO GTPases in the downregulated?</w:t>
+      </w:r>
+    </w:p>
+    <w:p>
+      <w:pPr>
+        <w:pStyle w:val="ListParagraph"/>
+        <w:numPr>
+          <w:ilvl w:val="1"/>
+          <w:numId w:val="5"/>
+        </w:numPr>
+        <w:rPr>
+          <w:b/>
+          <w:bCs/>
+        </w:rPr>
+      </w:pPr>
+      <w:r>
+        <w:rPr>
+          <w:b/>
+          <w:bCs/>
+        </w:rPr>
+        <w:t>NOTCH activates macrophages (Browne et al., 2026).</w:t>
+      </w:r>
+    </w:p>
+    <w:p>
+      <w:pPr>
+        <w:pStyle w:val="ListParagraph"/>
+        <w:numPr>
+          <w:ilvl w:val="1"/>
+          <w:numId w:val="5"/>
+        </w:numPr>
+        <w:rPr>
+          <w:b/>
+          <w:bCs/>
+        </w:rPr>
+      </w:pPr>
+      <w:r>
+        <w:rPr>
+          <w:b/>
+          <w:bCs/>
+        </w:rPr>
+        <w:t xml:space="preserve">WNT is involved in epithelial cell differentiation </w:t>
+      </w:r>
+      <w:r>
+        <w:rPr>
+          <w:b/>
+          <w:bCs/>
+        </w:rPr>
+        <w:t>https://febs.onlinelibrary.wiley.com/doi/10.1002/1873-3468.12851</w:t>
+      </w:r>
+    </w:p>
+    <w:p>
+      <w:pPr>
+        <w:pStyle w:val="ListParagraph"/>
+        <w:numPr>
+          <w:ilvl w:val="1"/>
+          <w:numId w:val="5"/>
+        </w:numPr>
+        <w:rPr>
+          <w:b/>
+          <w:bCs/>
+        </w:rPr>
+      </w:pPr>
+      <w:r>
+        <w:rPr>
+          <w:b/>
+          <w:bCs/>
+        </w:rPr>
+        <w:t xml:space="preserve">WNT affecting differentiation was in one of the papers in the project brief </w:t>
+      </w:r>
+      <w:r>
+        <w:rPr>
+          <w:b/>
+          <w:bCs/>
+        </w:rPr>
+        <w:t>https://isevjournals.onlinelibrary.wiley.com/doi/10.1002/jev2.12124</w:t>
+      </w:r>
+    </w:p>
+    <w:p>
+      <w:pPr>
+        <w:pStyle w:val="ListParagraph"/>
+        <w:numPr>
+          <w:ilvl w:val="1"/>
+          <w:numId w:val="5"/>
+        </w:numPr>
+        <w:rPr>
+          <w:b/>
+          <w:bCs/>
+        </w:rPr>
+      </w:pPr>
+      <w:r>
+        <w:rPr>
+          <w:b/>
+          <w:bCs/>
+        </w:rPr>
+        <w:t xml:space="preserve">“WNT is a key regulator of the human airway epithelium” </w:t>
+      </w:r>
+      <w:r>
+        <w:rPr>
+          <w:b/>
+          <w:bCs/>
+        </w:rPr>
+        <w:t>https://www.thelancet.com/journals/ebiom/article/PIIS2352-3964(20)30410-2/fulltext</w:t>
+      </w:r>
+    </w:p>
+    <w:p>
+      <w:pPr>
+        <w:pStyle w:val="ListParagraph"/>
+        <w:numPr>
+          <w:ilvl w:val="1"/>
+          <w:numId w:val="5"/>
+        </w:numPr>
+        <w:rPr>
+          <w:b/>
+          <w:bCs/>
+        </w:rPr>
+      </w:pPr>
+      <w:r>
+        <w:rPr>
+          <w:b/>
+          <w:bCs/>
+        </w:rPr>
+        <w:t xml:space="preserve">RHO GTPases are involved in epithelial cell-cell adhesion </w:t>
+      </w:r>
+      <w:r>
+        <w:rPr>
+          <w:b/>
+          <w:bCs/>
+        </w:rPr>
+        <w:t>https://www.sciencedirect.com/science/article/abs/pii/S0014482717301829</w:t>
       </w:r>
     </w:p>
     <w:p>
@@ -674,40 +2447,138 @@
         </w:numPr>
       </w:pPr>
       <w:r>
-        <w:t xml:space="preserve">Why do the same pathways appear in both upregulated and downregulated DE miRNAs for target gene-level enrichment? </w:t>
-      </w:r>
-    </w:p>
-    <w:p>
-      <w:pPr>
-        <w:pStyle w:val="ListParagraph"/>
-        <w:numPr>
-          <w:ilvl w:val="1"/>
-          <w:numId w:val="5"/>
-        </w:numPr>
-      </w:pPr>
-      <w:r>
-        <w:rPr>
-          <w:b/>
-          <w:bCs/>
-        </w:rPr>
-        <w:t>It is possible that they’re working antagonistically which could be a bit odd or the miRNAs might not actually be acting on the target genes involved in the pathway because this is just a hypothesis and there isn’t matching mRNA data to identify miRNA-mRNA relationships</w:t>
-      </w:r>
-    </w:p>
-    <w:p>
-      <w:pPr>
-        <w:pStyle w:val="ListParagraph"/>
-        <w:numPr>
-          <w:ilvl w:val="1"/>
-          <w:numId w:val="5"/>
-        </w:numPr>
-      </w:pPr>
-      <w:r>
-        <w:rPr>
-          <w:b/>
-          <w:bCs/>
-        </w:rPr>
-        <w:t>It is also possible that they are working agonistically because the target genes being targeted by upregulated are stimulatory and the downregulated ones are inhibitory therefore they are working in the same direction</w:t>
-      </w:r>
+        <w:t>How does Fc receptor signalling contribute to allergic sensitisation and interleukin signalling in airway inflammation?</w:t>
+      </w:r>
+    </w:p>
+    <w:p>
+      <w:pPr>
+        <w:pStyle w:val="ListParagraph"/>
+        <w:numPr>
+          <w:ilvl w:val="1"/>
+          <w:numId w:val="5"/>
+        </w:numPr>
+        <w:rPr>
+          <w:b/>
+          <w:bCs/>
+        </w:rPr>
+      </w:pPr>
+      <w:r>
+        <w:rPr>
+          <w:b/>
+          <w:bCs/>
+        </w:rPr>
+        <w:t xml:space="preserve">Fc receptors are found on immune cells and binding with these receptors can trigger immune cascades and lead to “hypersensitivity reactions”. </w:t>
+      </w:r>
+      <w:hyperlink r:id="rId5" w:history="1">
+        <w:r>
+          <w:rPr>
+            <w:rStyle w:val="Hyperlink"/>
+            <w:b/>
+            <w:bCs/>
+          </w:rPr>
+          <w:t>https://link.springer.com/article/10.1007/s12016-022-08955-9</w:t>
+        </w:r>
+      </w:hyperlink>
+    </w:p>
+    <w:p>
+      <w:pPr>
+        <w:pStyle w:val="ListParagraph"/>
+        <w:numPr>
+          <w:ilvl w:val="1"/>
+          <w:numId w:val="5"/>
+        </w:numPr>
+      </w:pPr>
+      <w:r>
+        <w:rPr>
+          <w:b/>
+          <w:bCs/>
+        </w:rPr>
+        <w:t xml:space="preserve">IL-13 induction can lead to “IL-13-mediated inflammatory response” </w:t>
+      </w:r>
+      <w:r>
+        <w:rPr>
+          <w:b/>
+          <w:bCs/>
+        </w:rPr>
+        <w:t xml:space="preserve">Browne et al., 2025 </w:t>
+      </w:r>
+      <w:hyperlink r:id="rId6" w:history="1">
+        <w:r>
+          <w:rPr>
+            <w:rStyle w:val="Hyperlink"/>
+            <w:b/>
+            <w:bCs/>
+          </w:rPr>
+          <w:t>https://www.mdpi.com/1422-0067/26/12/5</w:t>
+        </w:r>
+        <w:r>
+          <w:rPr>
+            <w:rStyle w:val="Hyperlink"/>
+            <w:b/>
+            <w:bCs/>
+          </w:rPr>
+          <w:t>7</w:t>
+        </w:r>
+        <w:r>
+          <w:rPr>
+            <w:rStyle w:val="Hyperlink"/>
+            <w:b/>
+            <w:bCs/>
+          </w:rPr>
+          <w:t>91</w:t>
+        </w:r>
+      </w:hyperlink>
+    </w:p>
+    <w:p>
+      <w:pPr>
+        <w:pStyle w:val="ListParagraph"/>
+        <w:numPr>
+          <w:ilvl w:val="2"/>
+          <w:numId w:val="5"/>
+        </w:numPr>
+      </w:pPr>
+      <w:r>
+        <w:rPr>
+          <w:b/>
+          <w:bCs/>
+        </w:rPr>
+        <w:t xml:space="preserve">IL-4 and IL-13 are the same pathway annotation in </w:t>
+      </w:r>
+      <w:proofErr w:type="spellStart"/>
+      <w:r>
+        <w:rPr>
+          <w:b/>
+          <w:bCs/>
+        </w:rPr>
+        <w:t>Reactome</w:t>
+      </w:r>
+      <w:proofErr w:type="spellEnd"/>
+    </w:p>
+    <w:p>
+      <w:pPr>
+        <w:pStyle w:val="ListParagraph"/>
+        <w:numPr>
+          <w:ilvl w:val="1"/>
+          <w:numId w:val="5"/>
+        </w:numPr>
+      </w:pPr>
+      <w:r>
+        <w:rPr>
+          <w:b/>
+          <w:bCs/>
+        </w:rPr>
+        <w:t xml:space="preserve">Interleukin source that discusses all interleukins: </w:t>
+      </w:r>
+      <w:hyperlink r:id="rId7" w:history="1">
+        <w:r>
+          <w:rPr>
+            <w:rStyle w:val="Hyperlink"/>
+            <w:b/>
+            <w:bCs/>
+          </w:rPr>
+          <w:t>https://www.jacionline.org/article/S0091-6749(16)30715-1/pdf</w:t>
+        </w:r>
+      </w:hyperlink>
     </w:p>
     <w:p>
       <w:pPr>
@@ -718,7 +2589,28 @@
         </w:numPr>
       </w:pPr>
       <w:r>
-        <w:t>How do WNT and NOTCH regulate epithelial barrier integrity in the upregulated target gene pathways and RHO GTPases in the downregulated?</w:t>
+        <w:t>What are Toll-like receptors?</w:t>
+      </w:r>
+    </w:p>
+    <w:p>
+      <w:pPr>
+        <w:pStyle w:val="ListParagraph"/>
+        <w:numPr>
+          <w:ilvl w:val="1"/>
+          <w:numId w:val="5"/>
+        </w:numPr>
+        <w:rPr>
+          <w:b/>
+          <w:bCs/>
+        </w:rPr>
+      </w:pPr>
+      <w:r>
+        <w:rPr>
+          <w:b/>
+          <w:bCs/>
+        </w:rPr>
+        <w:lastRenderedPageBreak/>
+        <w:t>These are usually expressed on first-line-of-defence cells such as macrophages (hence ‘toll’ like receptors) that recognise allergens and activate innate immune responses.</w:t>
       </w:r>
     </w:p>
     <w:p>
@@ -730,14 +2622,86 @@
         </w:numPr>
       </w:pPr>
       <w:r>
-        <w:t xml:space="preserve">Why is RT-qPCR necessary if you already have small RNA-seq data? </w:t>
-      </w:r>
-      <w:r>
-        <w:rPr>
-          <w:b/>
-          <w:bCs/>
-        </w:rPr>
-        <w:t>Small RNA-seq is genome-wide whereas PCR is very specific. Using both methods reduces the risk that results were found due to technical artefacts.</w:t>
+        <w:t>Why is RT-qPCR necessary if you already have small RNA-</w:t>
+      </w:r>
+      <w:proofErr w:type="spellStart"/>
+      <w:r>
+        <w:t>seq</w:t>
+      </w:r>
+      <w:proofErr w:type="spellEnd"/>
+      <w:r>
+        <w:t xml:space="preserve"> data? </w:t>
+      </w:r>
+    </w:p>
+    <w:p>
+      <w:pPr>
+        <w:pStyle w:val="ListParagraph"/>
+        <w:numPr>
+          <w:ilvl w:val="1"/>
+          <w:numId w:val="5"/>
+        </w:numPr>
+      </w:pPr>
+      <w:r>
+        <w:rPr>
+          <w:b/>
+          <w:bCs/>
+        </w:rPr>
+        <w:t>Small RNA-</w:t>
+      </w:r>
+      <w:proofErr w:type="spellStart"/>
+      <w:r>
+        <w:rPr>
+          <w:b/>
+          <w:bCs/>
+        </w:rPr>
+        <w:t>seq</w:t>
+      </w:r>
+      <w:proofErr w:type="spellEnd"/>
+      <w:r>
+        <w:rPr>
+          <w:b/>
+          <w:bCs/>
+        </w:rPr>
+        <w:t xml:space="preserve"> </w:t>
+      </w:r>
+      <w:r>
+        <w:rPr>
+          <w:b/>
+          <w:bCs/>
+        </w:rPr>
+        <w:t>tests all of the genomic data and is less specific, and prone to errors (</w:t>
+      </w:r>
+      <w:proofErr w:type="spellStart"/>
+      <w:r>
+        <w:rPr>
+          <w:b/>
+          <w:bCs/>
+        </w:rPr>
+        <w:t>e.g</w:t>
+      </w:r>
+      <w:proofErr w:type="spellEnd"/>
+      <w:r>
+        <w:rPr>
+          <w:b/>
+          <w:bCs/>
+        </w:rPr>
+        <w:t>, false base calls etc.) whereas PCR is very specific</w:t>
+      </w:r>
+    </w:p>
+    <w:p>
+      <w:pPr>
+        <w:pStyle w:val="ListParagraph"/>
+        <w:numPr>
+          <w:ilvl w:val="1"/>
+          <w:numId w:val="5"/>
+        </w:numPr>
+      </w:pPr>
+      <w:r>
+        <w:rPr>
+          <w:b/>
+          <w:bCs/>
+        </w:rPr>
+        <w:t>Using both methods reduces the risk that results were found due to technical artefacts.</w:t>
       </w:r>
     </w:p>
     <w:p>
@@ -751,6 +2715,15 @@
       <w:r>
         <w:t xml:space="preserve">You say more work is required to confirm that higher levels of rRNA and tRNA are observed in the three dose 24 primary HBEC samples. What further work would you do to confirm this? </w:t>
       </w:r>
+    </w:p>
+    <w:p>
+      <w:pPr>
+        <w:pStyle w:val="ListParagraph"/>
+        <w:numPr>
+          <w:ilvl w:val="1"/>
+          <w:numId w:val="5"/>
+        </w:numPr>
+      </w:pPr>
       <w:r>
         <w:rPr>
           <w:b/>
@@ -784,31 +2757,110 @@
           <w:b/>
           <w:bCs/>
         </w:rPr>
-        <w:t>The greatest technical challenge was developing the method for the pathway enrichment analysis because there were so many target genes that it was almost the whole proteome and there were so many different filtering techniques that weren’t biologically robust enough or were locked behind paywalls or lack of matched mRNA data.</w:t>
-      </w:r>
-    </w:p>
-    <w:p>
-      <w:pPr>
-        <w:pStyle w:val="ListParagraph"/>
-        <w:numPr>
-          <w:ilvl w:val="1"/>
-          <w:numId w:val="5"/>
-        </w:numPr>
-      </w:pPr>
-      <w:r>
-        <w:rPr>
-          <w:b/>
-          <w:bCs/>
-        </w:rPr>
-        <w:t xml:space="preserve">The greatest overall challenge was deciding what the project was actually about. Because I received the data in a staggered way, the aim of the project kept changing based on the results of the data as I could no longer do what I set out to do. This is a good example of how projects can change over time and when you are doing stuff in a short </w:t>
-      </w:r>
+        <w:t xml:space="preserve">The greatest technical challenge was developing the method for the pathway enrichment analysis because there were so many target genes that it was almost the whole </w:t>
+      </w:r>
+      <w:r>
+        <w:rPr>
+          <w:b/>
+          <w:bCs/>
+        </w:rPr>
+        <w:t>genome</w:t>
+      </w:r>
+      <w:r>
+        <w:rPr>
+          <w:b/>
+          <w:bCs/>
+        </w:rPr>
+        <w:t xml:space="preserve"> and there were so many different filtering techniques that weren’t biologically robust enough or were locked behind paywalls or lack of matched mRNA data.</w:t>
+      </w:r>
+    </w:p>
+    <w:p>
+      <w:pPr>
+        <w:pStyle w:val="ListParagraph"/>
+        <w:numPr>
+          <w:ilvl w:val="1"/>
+          <w:numId w:val="5"/>
+        </w:numPr>
+      </w:pPr>
+      <w:r>
+        <w:rPr>
+          <w:b/>
+          <w:bCs/>
+        </w:rPr>
+        <w:t>The greatest overall challenge was deciding what the project was actually about. Because I received the data in a staggered way, the aim of the project kept changing based on the results of the data as I could no longer do what I set out to do. This is a good example of how projects can change over time and when you are doing stuff in a short time period, you may not be able to reach the depth of analysis you might like to.</w:t>
+      </w:r>
+    </w:p>
+    <w:p>
+      <w:pPr>
+        <w:pStyle w:val="ListParagraph"/>
+        <w:numPr>
+          <w:ilvl w:val="0"/>
+          <w:numId w:val="5"/>
+        </w:numPr>
+      </w:pPr>
+      <w:r>
+        <w:t xml:space="preserve">You say very low levels of miRNA were detected – what would be an acceptable level of miRNA for this experiment and how would you suggest it be extracted? </w:t>
+      </w:r>
+    </w:p>
+    <w:p>
+      <w:pPr>
+        <w:pStyle w:val="ListParagraph"/>
+        <w:numPr>
+          <w:ilvl w:val="1"/>
+          <w:numId w:val="5"/>
+        </w:numPr>
+      </w:pPr>
+      <w:r>
+        <w:rPr>
+          <w:b/>
+          <w:bCs/>
+        </w:rPr>
+        <w:t xml:space="preserve">[check references for how much miRNA other studies used]. More samples could help compensate for lower levels of miRNA. </w:t>
+      </w:r>
+    </w:p>
+    <w:p>
+      <w:pPr>
+        <w:pStyle w:val="ListParagraph"/>
+        <w:numPr>
+          <w:ilvl w:val="1"/>
+          <w:numId w:val="5"/>
+        </w:numPr>
+      </w:pPr>
+      <w:r>
+        <w:rPr>
+          <w:b/>
+          <w:bCs/>
+        </w:rPr>
+        <w:t xml:space="preserve">Extracellular vesicles are produced variably among cell and tissue types therefore it is difficult for a one-size-fits-all approach. Additionally, EVs are produced more readily form airway epithelial cells in response to allergens which makes it trickier to get enough miRNA for reliable control samples which all DE analysis is performed against. </w:t>
+      </w:r>
+    </w:p>
+    <w:p>
+      <w:pPr>
+        <w:pStyle w:val="ListParagraph"/>
+        <w:numPr>
+          <w:ilvl w:val="0"/>
+          <w:numId w:val="5"/>
+        </w:numPr>
+      </w:pPr>
+      <w:r>
+        <w:t xml:space="preserve">You say that pathway enrichment analysis was not suitable for the Calu-3 dataset as there was insufficient levels of differential expression. How much differential expression would be enough? </w:t>
+      </w:r>
+    </w:p>
+    <w:p>
+      <w:pPr>
+        <w:pStyle w:val="ListParagraph"/>
+        <w:numPr>
+          <w:ilvl w:val="1"/>
+          <w:numId w:val="5"/>
+        </w:numPr>
+      </w:pPr>
       <w:r>
         <w:rPr>
           <w:b/>
           <w:bCs/>
         </w:rPr>
         <w:lastRenderedPageBreak/>
-        <w:t>time period, you may not be able to reach the depth of analysis you might like to.</w:t>
+        <w:t xml:space="preserve">I haven’t been able to find anything that is a clear threshold for this as it can depend on how well researched the miRNAs are and other factors but &gt;10 would probably be a rough minimum. </w:t>
       </w:r>
     </w:p>
     <w:p>
@@ -820,39 +2872,55 @@
         </w:numPr>
       </w:pPr>
       <w:r>
-        <w:t xml:space="preserve">You say very low levels of miRNA were detected – what would be an acceptable level of miRNA for this experiment and how would you suggest it be extracted? </w:t>
-      </w:r>
-    </w:p>
-    <w:p>
-      <w:pPr>
-        <w:pStyle w:val="ListParagraph"/>
-        <w:numPr>
-          <w:ilvl w:val="1"/>
-          <w:numId w:val="5"/>
-        </w:numPr>
-      </w:pPr>
-      <w:r>
-        <w:rPr>
-          <w:b/>
-          <w:bCs/>
-        </w:rPr>
-        <w:t xml:space="preserve">[check references for how much miRNA other studies used]. More samples could help compensate for lower levels of miRNA. </w:t>
-      </w:r>
-    </w:p>
-    <w:p>
-      <w:pPr>
-        <w:pStyle w:val="ListParagraph"/>
-        <w:numPr>
-          <w:ilvl w:val="1"/>
-          <w:numId w:val="5"/>
-        </w:numPr>
-      </w:pPr>
-      <w:r>
-        <w:rPr>
-          <w:b/>
-          <w:bCs/>
-        </w:rPr>
-        <w:t xml:space="preserve">Extracellular vesicles are produced variably among cell and tissue types therefore it is difficult for a one-size-fits-all approach. Additionally, EVs are produced more readily form airway epithelial cells in response to allergens which makes it trickier to get enough miRNA for reliable control samples which all DE analysis is performed against. </w:t>
+        <w:t xml:space="preserve">You say more research is required to validate the finding that miR-125b-5p may be a common allergen response miRNA – what would that extra research be? </w:t>
+      </w:r>
+    </w:p>
+    <w:p>
+      <w:pPr>
+        <w:pStyle w:val="ListParagraph"/>
+        <w:numPr>
+          <w:ilvl w:val="1"/>
+          <w:numId w:val="5"/>
+        </w:numPr>
+      </w:pPr>
+      <w:r>
+        <w:rPr>
+          <w:b/>
+          <w:bCs/>
+        </w:rPr>
+        <w:t>Test in more samples/donors</w:t>
+      </w:r>
+    </w:p>
+    <w:p>
+      <w:pPr>
+        <w:pStyle w:val="ListParagraph"/>
+        <w:numPr>
+          <w:ilvl w:val="1"/>
+          <w:numId w:val="5"/>
+        </w:numPr>
+      </w:pPr>
+      <w:r>
+        <w:rPr>
+          <w:b/>
+          <w:bCs/>
+        </w:rPr>
+        <w:t>Test in more cell types</w:t>
+      </w:r>
+    </w:p>
+    <w:p>
+      <w:pPr>
+        <w:pStyle w:val="ListParagraph"/>
+        <w:numPr>
+          <w:ilvl w:val="1"/>
+          <w:numId w:val="5"/>
+        </w:numPr>
+      </w:pPr>
+      <w:r>
+        <w:rPr>
+          <w:b/>
+          <w:bCs/>
+        </w:rPr>
+        <w:t>Look for research indicating its role across allergens</w:t>
       </w:r>
     </w:p>
     <w:p>
@@ -864,14 +2932,61 @@
         </w:numPr>
       </w:pPr>
       <w:r>
-        <w:t xml:space="preserve">You say that pathway enrichment analysis was not suitable for the Calu-3 dataset as there was insufficient levels of differential expression. How much differential expression would be enough? </w:t>
-      </w:r>
-      <w:r>
-        <w:rPr>
-          <w:b/>
-          <w:bCs/>
-        </w:rPr>
-        <w:t xml:space="preserve">I haven’t been able to find anything that is a clear threshold for this as it can depend on how well researched the miRNAs are and other factors but &gt;10 would probably be a rough minimum. </w:t>
+        <w:t>How do you know WNT/NOTCH/</w:t>
+      </w:r>
+      <w:proofErr w:type="spellStart"/>
+      <w:r>
+        <w:t>RHOGTPase</w:t>
+      </w:r>
+      <w:proofErr w:type="spellEnd"/>
+      <w:r>
+        <w:t xml:space="preserve"> pathways are involved in epithelial barrier homeostasis? </w:t>
+      </w:r>
+    </w:p>
+    <w:p>
+      <w:pPr>
+        <w:pStyle w:val="ListParagraph"/>
+        <w:numPr>
+          <w:ilvl w:val="1"/>
+          <w:numId w:val="5"/>
+        </w:numPr>
+      </w:pPr>
+      <w:r>
+        <w:rPr>
+          <w:b/>
+          <w:bCs/>
+        </w:rPr>
+        <w:t>Each role defined above.</w:t>
+      </w:r>
+    </w:p>
+    <w:p>
+      <w:pPr>
+        <w:pStyle w:val="ListParagraph"/>
+        <w:numPr>
+          <w:ilvl w:val="1"/>
+          <w:numId w:val="5"/>
+        </w:numPr>
+      </w:pPr>
+      <w:r>
+        <w:rPr>
+          <w:b/>
+          <w:bCs/>
+        </w:rPr>
+        <w:t xml:space="preserve">But because these are massive pathways that regulate so many different things, it is speculative to say that they are targeted in this </w:t>
+      </w:r>
+      <w:r>
+        <w:rPr>
+          <w:b/>
+          <w:bCs/>
+        </w:rPr>
+        <w:t xml:space="preserve">biological </w:t>
+      </w:r>
+      <w:r>
+        <w:rPr>
+          <w:b/>
+          <w:bCs/>
+        </w:rPr>
+        <w:t>model and affect barrier integrity – more research needed.</w:t>
       </w:r>
     </w:p>
     <w:p>
@@ -883,7 +2998,140 @@
         </w:numPr>
       </w:pPr>
       <w:r>
-        <w:t xml:space="preserve">You say more research is required to validate the finding that miR-125b-5p may be a common allergen response miRNA – what would that extra research be? </w:t>
+        <w:t xml:space="preserve">What normalisation method did you use for differential expression analysis? </w:t>
+      </w:r>
+    </w:p>
+    <w:p>
+      <w:pPr>
+        <w:pStyle w:val="ListParagraph"/>
+        <w:numPr>
+          <w:ilvl w:val="1"/>
+          <w:numId w:val="5"/>
+        </w:numPr>
+      </w:pPr>
+      <w:r>
+        <w:rPr>
+          <w:b/>
+          <w:bCs/>
+        </w:rPr>
+        <w:t>I used TMM normalisation which is the Trimmed Mean of M-values</w:t>
+      </w:r>
+      <w:r>
+        <w:t xml:space="preserve">. </w:t>
+      </w:r>
+      <w:r>
+        <w:rPr>
+          <w:b/>
+          <w:bCs/>
+        </w:rPr>
+        <w:t>It uses the empirical Bayesian approach to basically normalise for sequencing depth.</w:t>
+      </w:r>
+      <w:r>
+        <w:rPr>
+          <w:b/>
+          <w:bCs/>
+        </w:rPr>
+        <w:t xml:space="preserve"> It is the default edgeR normalisation method.</w:t>
+      </w:r>
+    </w:p>
+    <w:p>
+      <w:pPr>
+        <w:pStyle w:val="ListParagraph"/>
+        <w:numPr>
+          <w:ilvl w:val="1"/>
+          <w:numId w:val="5"/>
+        </w:numPr>
+      </w:pPr>
+      <w:r>
+        <w:rPr>
+          <w:rFonts w:ascii="Segoe UI" w:hAnsi="Segoe UI" w:cs="Segoe UI"/>
+          <w:b/>
+          <w:bCs/>
+          <w:sz w:val="21"/>
+          <w:szCs w:val="21"/>
+          <w:shd w:val="clear" w:color="auto" w:fill="FFFFFF"/>
+        </w:rPr>
+        <w:t>“</w:t>
+      </w:r>
+      <w:r>
+        <w:rPr>
+          <w:rFonts w:ascii="Segoe UI" w:hAnsi="Segoe UI" w:cs="Segoe UI"/>
+          <w:b/>
+          <w:bCs/>
+          <w:sz w:val="21"/>
+          <w:szCs w:val="21"/>
+          <w:shd w:val="clear" w:color="auto" w:fill="FFFFFF"/>
+        </w:rPr>
+        <w:t>TMM is recommended for most RNA-</w:t>
+      </w:r>
+      <w:proofErr w:type="spellStart"/>
+      <w:r>
+        <w:rPr>
+          <w:rFonts w:ascii="Segoe UI" w:hAnsi="Segoe UI" w:cs="Segoe UI"/>
+          <w:b/>
+          <w:bCs/>
+          <w:sz w:val="21"/>
+          <w:szCs w:val="21"/>
+          <w:shd w:val="clear" w:color="auto" w:fill="FFFFFF"/>
+        </w:rPr>
+        <w:t>Seq</w:t>
+      </w:r>
+      <w:proofErr w:type="spellEnd"/>
+      <w:r>
+        <w:rPr>
+          <w:rFonts w:ascii="Segoe UI" w:hAnsi="Segoe UI" w:cs="Segoe UI"/>
+          <w:b/>
+          <w:bCs/>
+          <w:sz w:val="21"/>
+          <w:szCs w:val="21"/>
+          <w:shd w:val="clear" w:color="auto" w:fill="FFFFFF"/>
+        </w:rPr>
+        <w:t xml:space="preserve"> data where the majority (more than half) of the genes are believed not differentially expressed between any pair of the samples</w:t>
+      </w:r>
+      <w:r>
+        <w:rPr>
+          <w:rFonts w:ascii="Segoe UI" w:hAnsi="Segoe UI" w:cs="Segoe UI"/>
+          <w:b/>
+          <w:bCs/>
+          <w:sz w:val="21"/>
+          <w:szCs w:val="21"/>
+          <w:shd w:val="clear" w:color="auto" w:fill="FFFFFF"/>
+        </w:rPr>
+        <w:t xml:space="preserve">” </w:t>
+      </w:r>
+      <w:r>
+        <w:rPr>
+          <w:rFonts w:ascii="Segoe UI" w:hAnsi="Segoe UI" w:cs="Segoe UI"/>
+          <w:sz w:val="21"/>
+          <w:szCs w:val="21"/>
+          <w:shd w:val="clear" w:color="auto" w:fill="FFFFFF"/>
+        </w:rPr>
+        <w:sym w:font="Wingdings" w:char="F0E0"/>
+      </w:r>
+      <w:r>
+        <w:rPr>
+          <w:rFonts w:ascii="Segoe UI" w:hAnsi="Segoe UI" w:cs="Segoe UI"/>
+          <w:sz w:val="21"/>
+          <w:szCs w:val="21"/>
+          <w:shd w:val="clear" w:color="auto" w:fill="FFFFFF"/>
+        </w:rPr>
+        <w:t xml:space="preserve"> from the edgeR documentation</w:t>
+      </w:r>
+    </w:p>
+    <w:p>
+      <w:pPr>
+        <w:pStyle w:val="ListParagraph"/>
+        <w:numPr>
+          <w:ilvl w:val="1"/>
+          <w:numId w:val="5"/>
+        </w:numPr>
+      </w:pPr>
+      <w:r>
+        <w:rPr>
+          <w:b/>
+          <w:bCs/>
+        </w:rPr>
+        <w:t>Then used a quasi-likelihood F test to fit the statistical model.</w:t>
       </w:r>
     </w:p>
     <w:p>
@@ -895,56 +3143,46 @@
         </w:numPr>
       </w:pPr>
       <w:r>
-        <w:t xml:space="preserve">How do you know WNT/NOTCH/RHOGTPase pathways are involved in epithelial barrier homeostasis? </w:t>
-      </w:r>
-      <w:r>
-        <w:rPr>
-          <w:b/>
-          <w:bCs/>
-        </w:rPr>
-        <w:t>WNT and NOTCH I’ve seen in papers [think this is in Browne’s 2025 review</w:t>
-      </w:r>
-      <w:r>
-        <w:rPr>
-          <w:b/>
-          <w:bCs/>
-        </w:rPr>
-        <w:t xml:space="preserve"> – WNT implicated in tight junction maintenance</w:t>
-      </w:r>
-      <w:r>
-        <w:rPr>
-          <w:b/>
-          <w:bCs/>
-        </w:rPr>
-        <w:t xml:space="preserve">], RHO </w:t>
-      </w:r>
-      <w:r>
-        <w:rPr>
-          <w:b/>
-          <w:bCs/>
-        </w:rPr>
-        <w:t>GTPase was a google.</w:t>
-      </w:r>
-      <w:r>
-        <w:rPr>
-          <w:b/>
-          <w:bCs/>
-        </w:rPr>
-        <w:t xml:space="preserve"> But because these are massive pathways that regulate so many different things, it is speculative to say that they are targeted in this </w:t>
-      </w:r>
-      <w:r>
-        <w:rPr>
-          <w:b/>
-          <w:bCs/>
-        </w:rPr>
-        <w:t xml:space="preserve">biological </w:t>
-      </w:r>
-      <w:r>
-        <w:rPr>
-          <w:b/>
-          <w:bCs/>
-        </w:rPr>
-        <w:t>model and affect barrier integrity – more research needed.</w:t>
+        <w:t xml:space="preserve">Why was miR-125b classed as a potential candidate for further research? </w:t>
+      </w:r>
+    </w:p>
+    <w:p>
+      <w:pPr>
+        <w:pStyle w:val="ListParagraph"/>
+        <w:numPr>
+          <w:ilvl w:val="1"/>
+          <w:numId w:val="5"/>
+        </w:numPr>
+      </w:pPr>
+      <w:r>
+        <w:rPr>
+          <w:b/>
+          <w:bCs/>
+        </w:rPr>
+        <w:t xml:space="preserve">More publications so it may play a greater role. </w:t>
+      </w:r>
+    </w:p>
+    <w:p>
+      <w:pPr>
+        <w:pStyle w:val="ListParagraph"/>
+        <w:numPr>
+          <w:ilvl w:val="1"/>
+          <w:numId w:val="5"/>
+        </w:numPr>
+      </w:pPr>
+      <w:r>
+        <w:rPr>
+          <w:b/>
+          <w:bCs/>
+        </w:rPr>
+        <w:t>Also, it was detected in the protease</w:t>
+      </w:r>
+      <w:r>
+        <w:rPr>
+          <w:b/>
+          <w:bCs/>
+        </w:rPr>
+        <w:t xml:space="preserve"> dose 24 dataset so may be a common allergen response miRNA. The workflow needs to be repeated on robust data to confirm its differential expression.</w:t>
       </w:r>
     </w:p>
     <w:p>
@@ -956,20 +3194,39 @@
         </w:numPr>
       </w:pPr>
       <w:r>
-        <w:t xml:space="preserve">What normalisation method did you use for differential expression analysis? </w:t>
-      </w:r>
-      <w:r>
-        <w:rPr>
-          <w:b/>
-          <w:bCs/>
-        </w:rPr>
-        <w:t>I used TMM normalisation which is the Trimmed Mean of M-values</w:t>
-      </w:r>
-      <w:r>
-        <w:t>. It uses the empirical Bayesian approach to basically normalise for sequencing depth.</w:t>
-      </w:r>
-      <w:r>
-        <w:t xml:space="preserve"> It is the default edgeR normalisation method.</w:t>
+        <w:t xml:space="preserve">What is the significance of being able to handle spike in controls? </w:t>
+      </w:r>
+    </w:p>
+    <w:p>
+      <w:pPr>
+        <w:pStyle w:val="ListParagraph"/>
+        <w:numPr>
+          <w:ilvl w:val="1"/>
+          <w:numId w:val="5"/>
+        </w:numPr>
+      </w:pPr>
+      <w:r>
+        <w:rPr>
+          <w:b/>
+          <w:bCs/>
+        </w:rPr>
+        <w:t xml:space="preserve">Spike in controls were present in the sequencing data made available for me, but I was not able to use it due to the complexity of handling it. </w:t>
+      </w:r>
+    </w:p>
+    <w:p>
+      <w:pPr>
+        <w:pStyle w:val="ListParagraph"/>
+        <w:numPr>
+          <w:ilvl w:val="1"/>
+          <w:numId w:val="5"/>
+        </w:numPr>
+      </w:pPr>
+      <w:r>
+        <w:rPr>
+          <w:b/>
+          <w:bCs/>
+        </w:rPr>
+        <w:t>Because miRNA is a minor constituent of the sequencing library, there are likely going to be lots of lowly expressed miRNAs and therefore it is really important to improve the analysis of them</w:t>
       </w:r>
     </w:p>
     <w:p>
@@ -981,21 +3238,46 @@
         </w:numPr>
       </w:pPr>
       <w:r>
-        <w:t xml:space="preserve">Why was miR-125b classed as a potential candidate for further research? </w:t>
-      </w:r>
-      <w:r>
-        <w:rPr>
-          <w:b/>
-          <w:bCs/>
-        </w:rPr>
-        <w:t>More publications so it may play a greater role. Also, it was detected in the protease</w:t>
-      </w:r>
-      <w:r>
-        <w:rPr>
-          <w:b/>
-          <w:bCs/>
-        </w:rPr>
-        <w:t xml:space="preserve"> dose 24 dataset so may be a common allergen response miRNA. The workflow needs to be repeated on robust data to confirm its differential expression.</w:t>
+        <w:t xml:space="preserve">How many different types of miRNA are there? </w:t>
+      </w:r>
+    </w:p>
+    <w:p>
+      <w:pPr>
+        <w:pStyle w:val="ListParagraph"/>
+        <w:numPr>
+          <w:ilvl w:val="1"/>
+          <w:numId w:val="5"/>
+        </w:numPr>
+      </w:pPr>
+      <w:r>
+        <w:rPr>
+          <w:b/>
+          <w:bCs/>
+        </w:rPr>
+        <w:t>Around 1900 different ones</w:t>
+      </w:r>
+      <w:r>
+        <w:rPr>
+          <w:b/>
+          <w:bCs/>
+        </w:rPr>
+        <w:t xml:space="preserve"> (most of which are in the </w:t>
+      </w:r>
+      <w:proofErr w:type="spellStart"/>
+      <w:r>
+        <w:rPr>
+          <w:b/>
+          <w:bCs/>
+        </w:rPr>
+        <w:t>mirbase</w:t>
+      </w:r>
+      <w:proofErr w:type="spellEnd"/>
+      <w:r>
+        <w:rPr>
+          <w:b/>
+          <w:bCs/>
+        </w:rPr>
+        <w:t xml:space="preserve"> database).</w:t>
       </w:r>
     </w:p>
     <w:p>
@@ -1007,14 +3289,147 @@
         </w:numPr>
       </w:pPr>
       <w:r>
-        <w:t xml:space="preserve">What is the significance of being able to handle spike in controls? </w:t>
-      </w:r>
-      <w:r>
-        <w:rPr>
-          <w:b/>
-          <w:bCs/>
-        </w:rPr>
-        <w:t>Spike in controls were present in the sequencing data made available for me, but I was not able to use it due to the complexity of handling it. Because miRNA is a minor constituent of the sequencing library, there are likely going to be lots of lowly expressed miRNAs and therefore it is really important to improve the analysis of them</w:t>
+        <w:t xml:space="preserve">Did you try network-based enrichment? </w:t>
+      </w:r>
+    </w:p>
+    <w:p>
+      <w:pPr>
+        <w:pStyle w:val="ListParagraph"/>
+        <w:numPr>
+          <w:ilvl w:val="1"/>
+          <w:numId w:val="5"/>
+        </w:numPr>
+      </w:pPr>
+      <w:r>
+        <w:rPr>
+          <w:b/>
+          <w:bCs/>
+        </w:rPr>
+        <w:t xml:space="preserve">Yes, I used </w:t>
+      </w:r>
+      <w:proofErr w:type="spellStart"/>
+      <w:r>
+        <w:rPr>
+          <w:b/>
+          <w:bCs/>
+        </w:rPr>
+        <w:t>miRNet</w:t>
+      </w:r>
+      <w:proofErr w:type="spellEnd"/>
+      <w:r>
+        <w:rPr>
+          <w:b/>
+          <w:bCs/>
+        </w:rPr>
+        <w:t xml:space="preserve"> but </w:t>
+      </w:r>
+      <w:r>
+        <w:rPr>
+          <w:b/>
+          <w:bCs/>
+        </w:rPr>
+        <w:t>this resulted in very highly connected and complex networks.</w:t>
+      </w:r>
+    </w:p>
+    <w:p>
+      <w:pPr>
+        <w:pStyle w:val="ListParagraph"/>
+        <w:numPr>
+          <w:ilvl w:val="1"/>
+          <w:numId w:val="5"/>
+        </w:numPr>
+      </w:pPr>
+      <w:r>
+        <w:rPr>
+          <w:b/>
+          <w:bCs/>
+        </w:rPr>
+        <w:t>T</w:t>
+      </w:r>
+      <w:r>
+        <w:rPr>
+          <w:b/>
+          <w:bCs/>
+        </w:rPr>
+        <w:t xml:space="preserve">hey needed filter thresholds that were mostly arbitrary; I only found one paper that suggested thresholds but couldn’t see a justification </w:t>
+      </w:r>
+      <w:r>
+        <w:rPr>
+          <w:b/>
+          <w:bCs/>
+        </w:rPr>
+        <w:lastRenderedPageBreak/>
+        <w:t xml:space="preserve">therefore didn’t want to apply it to my work. </w:t>
+      </w:r>
+      <w:hyperlink r:id="rId8" w:history="1">
+        <w:r>
+          <w:rPr>
+            <w:rStyle w:val="Hyperlink"/>
+            <w:b/>
+            <w:bCs/>
+          </w:rPr>
+          <w:t>https://www.mirnet.ca/mi</w:t>
+        </w:r>
+        <w:r>
+          <w:rPr>
+            <w:rStyle w:val="Hyperlink"/>
+            <w:b/>
+            <w:bCs/>
+          </w:rPr>
+          <w:t>R</w:t>
+        </w:r>
+        <w:r>
+          <w:rPr>
+            <w:rStyle w:val="Hyperlink"/>
+            <w:b/>
+            <w:bCs/>
+          </w:rPr>
+          <w:t>Net/</w:t>
+        </w:r>
+      </w:hyperlink>
+    </w:p>
+    <w:p>
+      <w:pPr>
+        <w:pStyle w:val="ListParagraph"/>
+        <w:numPr>
+          <w:ilvl w:val="1"/>
+          <w:numId w:val="5"/>
+        </w:numPr>
+      </w:pPr>
+      <w:r>
+        <w:rPr>
+          <w:b/>
+          <w:bCs/>
+        </w:rPr>
+        <w:t xml:space="preserve"> Degree filter: “</w:t>
+      </w:r>
+      <w:r>
+        <w:t>The degree of a node is the number of connections it has to other nodes. Nodes with higher node degree act as hubs in a network.</w:t>
+      </w:r>
+      <w:r>
+        <w:t>”</w:t>
+      </w:r>
+    </w:p>
+    <w:p>
+      <w:pPr>
+        <w:pStyle w:val="ListParagraph"/>
+        <w:numPr>
+          <w:ilvl w:val="1"/>
+          <w:numId w:val="5"/>
+        </w:numPr>
+      </w:pPr>
+      <w:r>
+        <w:rPr>
+          <w:b/>
+          <w:bCs/>
+        </w:rPr>
+        <w:t>Betweenness filter: “</w:t>
+      </w:r>
+      <w:r>
+        <w:t>measures the number of shortest paths going through the node. It takes into consideration the global network structure.</w:t>
+      </w:r>
+      <w:r>
+        <w:t>”</w:t>
       </w:r>
     </w:p>
     <w:p>
@@ -1026,23 +3441,25 @@
         </w:numPr>
       </w:pPr>
       <w:r>
-        <w:lastRenderedPageBreak/>
-        <w:t xml:space="preserve">How many different types of miRNA are there? </w:t>
-      </w:r>
-      <w:r>
-        <w:rPr>
-          <w:b/>
-          <w:bCs/>
-        </w:rPr>
-        <w:t>Around 1900 different ones</w:t>
-      </w:r>
-      <w:r>
-        <w:rPr>
-          <w:b/>
-          <w:bCs/>
-        </w:rPr>
-        <w:t xml:space="preserve"> (most of which are in the mirbase database).</w:t>
-      </w:r>
+        <w:t>Need to justify the points made in the discussion.</w:t>
+      </w:r>
+    </w:p>
+    <w:p>
+      <w:pPr>
+        <w:pStyle w:val="ListParagraph"/>
+        <w:numPr>
+          <w:ilvl w:val="0"/>
+          <w:numId w:val="5"/>
+        </w:numPr>
+      </w:pPr>
+      <w:r>
+        <w:t>Current state of the field and any recent advancements?</w:t>
+      </w:r>
+    </w:p>
+    <w:p>
+      <w:pPr>
+        <w:pStyle w:val="ListParagraph"/>
+      </w:pPr>
     </w:p>
     <w:p/>
     <w:p>
@@ -1084,7 +3501,7 @@
         <w:rFonts w:hint="default"/>
       </w:rPr>
     </w:lvl>
-    <w:lvl w:ilvl="1" w:tplc="08090019" w:tentative="1">
+    <w:lvl w:ilvl="1" w:tplc="08090019">
       <w:start w:val="1"/>
       <w:numFmt w:val="lowerLetter"/>
       <w:lvlText w:val="%2."/>
@@ -1685,7 +4102,7 @@
         <w:ind w:left="1440" w:hanging="360"/>
       </w:pPr>
     </w:lvl>
-    <w:lvl w:ilvl="2" w:tplc="0809001B" w:tentative="1">
+    <w:lvl w:ilvl="2" w:tplc="0809001B">
       <w:start w:val="1"/>
       <w:numFmt w:val="lowerRoman"/>
       <w:lvlText w:val="%3."/>
@@ -1694,7 +4111,7 @@
         <w:ind w:left="2160" w:hanging="180"/>
       </w:pPr>
     </w:lvl>
-    <w:lvl w:ilvl="3" w:tplc="0809000F" w:tentative="1">
+    <w:lvl w:ilvl="3" w:tplc="0809000F">
       <w:start w:val="1"/>
       <w:numFmt w:val="decimal"/>
       <w:lvlText w:val="%4."/>

</xml_diff>